<commit_message>
kỳ tới lọc máy và phiếu công nghẹ từ Nhóm
</commit_message>
<xml_diff>
--- a/VanTuongApp/io/in/DM1.docx
+++ b/VanTuongApp/io/in/DM1.docx
@@ -4,36 +4,12 @@
   <w:body>
     <w:p>
       <w:pPr>
-        <w:pStyle w:val="Heading3"/>
-        <w:jc w:val="center"/>
-        <w:rPr>
-          <w:rFonts w:ascii="Times New Roman" w:hAnsi="Times New Roman" w:cs="Times New Roman"/>
-          <w:b/>
-          <w:color w:val="auto"/>
-          <w:sz w:val="28"/>
-          <w:szCs w:val="28"/>
-        </w:rPr>
-      </w:pPr>
-      <w:bookmarkStart w:id="0" w:name="_Toc121498585"/>
-      <w:r>
-        <w:rPr>
-          <w:rFonts w:ascii="Times New Roman" w:hAnsi="Times New Roman" w:cs="Times New Roman"/>
-          <w:b/>
-          <w:color w:val="auto"/>
-          <w:sz w:val="28"/>
-          <w:szCs w:val="28"/>
-        </w:rPr>
-        <w:t>1. TỔ HỢP THỦY ÂM МГК-400ЭМ</w:t>
-      </w:r>
-      <w:bookmarkEnd w:id="0"/>
-    </w:p>
-    <w:p>
-      <w:pPr>
         <w:spacing w:after="0"/>
         <w:jc w:val="center"/>
         <w:rPr>
           <w:rFonts w:ascii="Times New Roman" w:eastAsia="Times New Roman" w:hAnsi="Times New Roman" w:cs="Times New Roman"/>
           <w:b/>
+          <w:lang w:val="vi-VN"/>
         </w:rPr>
       </w:pPr>
       <w:r>
@@ -42,6 +18,7 @@
           <w:b/>
           <w:sz w:val="28"/>
           <w:szCs w:val="28"/>
+          <w:lang w:val="vi-VN"/>
         </w:rPr>
         <w:t xml:space="preserve">PHIẾU CÔNG NGHỆ BQDP </w:t>
       </w:r>
@@ -50,6 +27,7 @@
           <w:rFonts w:ascii="Times New Roman" w:hAnsi="Times New Roman" w:cs="Times New Roman"/>
           <w:sz w:val="28"/>
           <w:szCs w:val="28"/>
+          <w:lang w:val="vi-VN"/>
         </w:rPr>
         <w:t>-</w:t>
       </w:r>
@@ -59,6 +37,7 @@
           <w:b/>
           <w:sz w:val="28"/>
           <w:szCs w:val="28"/>
+          <w:lang w:val="vi-VN"/>
         </w:rPr>
         <w:t xml:space="preserve"> KSĐK</w:t>
       </w:r>
@@ -74,6 +53,7 @@
           <w:color w:val="auto"/>
           <w:sz w:val="28"/>
           <w:szCs w:val="28"/>
+          <w:lang w:val="vi-VN"/>
         </w:rPr>
       </w:pPr>
       <w:r>
@@ -84,91 +64,22 @@
           <w:color w:val="auto"/>
           <w:sz w:val="28"/>
           <w:szCs w:val="28"/>
+          <w:lang w:val="vi-VN"/>
         </w:rPr>
-        <w:t>PHIẾU SỐ: 01 (</w:t>
-      </w:r>
-      <w:proofErr w:type="spellStart"/>
-      <w:r>
-        <w:rPr>
-          <w:rFonts w:ascii="Times New Roman" w:eastAsia="Times New Roman" w:hAnsi="Times New Roman" w:cs="Times New Roman"/>
-          <w:b/>
-          <w:i w:val="0"/>
-          <w:color w:val="auto"/>
-          <w:sz w:val="28"/>
-          <w:szCs w:val="28"/>
-        </w:rPr>
-        <w:t>Bảo</w:t>
-      </w:r>
-      <w:proofErr w:type="spellEnd"/>
-      <w:r>
-        <w:rPr>
-          <w:rFonts w:ascii="Times New Roman" w:eastAsia="Times New Roman" w:hAnsi="Times New Roman" w:cs="Times New Roman"/>
-          <w:b/>
-          <w:i w:val="0"/>
-          <w:color w:val="auto"/>
-          <w:sz w:val="28"/>
-          <w:szCs w:val="28"/>
-        </w:rPr>
-        <w:t xml:space="preserve"> </w:t>
-      </w:r>
-      <w:proofErr w:type="spellStart"/>
-      <w:r>
-        <w:rPr>
-          <w:rFonts w:ascii="Times New Roman" w:eastAsia="Times New Roman" w:hAnsi="Times New Roman" w:cs="Times New Roman"/>
-          <w:b/>
-          <w:i w:val="0"/>
-          <w:color w:val="auto"/>
-          <w:sz w:val="28"/>
-          <w:szCs w:val="28"/>
-        </w:rPr>
-        <w:t>quản</w:t>
-      </w:r>
-      <w:proofErr w:type="spellEnd"/>
-      <w:r>
-        <w:rPr>
-          <w:rFonts w:ascii="Times New Roman" w:eastAsia="Times New Roman" w:hAnsi="Times New Roman" w:cs="Times New Roman"/>
-          <w:b/>
-          <w:i w:val="0"/>
-          <w:color w:val="auto"/>
-          <w:sz w:val="28"/>
-          <w:szCs w:val="28"/>
-        </w:rPr>
-        <w:t xml:space="preserve"> </w:t>
-      </w:r>
-      <w:proofErr w:type="spellStart"/>
-      <w:r>
-        <w:rPr>
-          <w:rFonts w:ascii="Times New Roman" w:eastAsia="Times New Roman" w:hAnsi="Times New Roman" w:cs="Times New Roman"/>
-          <w:b/>
-          <w:i w:val="0"/>
-          <w:color w:val="auto"/>
-          <w:sz w:val="28"/>
-          <w:szCs w:val="28"/>
-        </w:rPr>
-        <w:t>Tuần</w:t>
-      </w:r>
-      <w:proofErr w:type="spellEnd"/>
-      <w:r>
-        <w:rPr>
-          <w:rFonts w:ascii="Times New Roman" w:eastAsia="Times New Roman" w:hAnsi="Times New Roman" w:cs="Times New Roman"/>
-          <w:b/>
-          <w:i w:val="0"/>
-          <w:color w:val="auto"/>
-          <w:sz w:val="28"/>
-          <w:szCs w:val="28"/>
-        </w:rPr>
-        <w:t>)</w:t>
+        <w:t>PHIẾU SỐ: 01, 02 (Bảo quản Tuần, Tháng)</w:t>
       </w:r>
     </w:p>
     <w:p>
       <w:pPr>
         <w:spacing w:after="0"/>
+        <w:ind w:left="15"/>
         <w:jc w:val="center"/>
         <w:rPr>
           <w:rFonts w:ascii="Times New Roman" w:hAnsi="Times New Roman" w:cs="Times New Roman"/>
           <w:b/>
           <w:sz w:val="28"/>
           <w:szCs w:val="28"/>
+          <w:lang w:val="vi-VN"/>
         </w:rPr>
       </w:pPr>
       <w:r>
@@ -177,6 +88,7 @@
           <w:b/>
           <w:sz w:val="28"/>
           <w:szCs w:val="28"/>
+          <w:lang w:val="vi-VN"/>
         </w:rPr>
         <w:t xml:space="preserve">TÊN TRANG BỊ: </w:t>
       </w:r>
@@ -186,17 +98,20 @@
           <w:b/>
           <w:sz w:val="28"/>
           <w:szCs w:val="28"/>
+          <w:lang w:val="vi-VN"/>
         </w:rPr>
-        <w:t>TỔ HỢP THỦY ÂM МГК-400ЭМ</w:t>
+        <w:t>TRẠM THỦY ÂM PHÁT TÍN HIỆU SỰ CỐ МГС-30</w:t>
       </w:r>
     </w:p>
     <w:p>
       <w:pPr>
         <w:spacing w:after="0"/>
+        <w:ind w:left="15"/>
         <w:jc w:val="center"/>
         <w:rPr>
           <w:rFonts w:ascii="Times New Roman" w:hAnsi="Times New Roman" w:cs="Times New Roman"/>
           <w:i/>
+          <w:lang w:val="vi-VN"/>
         </w:rPr>
       </w:pPr>
     </w:p>
@@ -218,9 +133,6 @@
         <w:gridCol w:w="911"/>
       </w:tblGrid>
       <w:tr>
-        <w:trPr>
-          <w:tblHeader/>
-        </w:trPr>
         <w:tc>
           <w:tcPr>
             <w:tcW w:w="215" w:type="pct"/>
@@ -234,6 +146,7 @@
                 <w:lang w:val="en-US"/>
               </w:rPr>
             </w:pPr>
+            <w:bookmarkStart w:id="0" w:name="_Hlk119069354"/>
             <w:r>
               <w:rPr>
                 <w:b/>
@@ -408,21 +321,12 @@
               <w:t>gian</w:t>
             </w:r>
             <w:proofErr w:type="spellEnd"/>
-          </w:p>
-          <w:p>
-            <w:pPr>
-              <w:jc w:val="center"/>
+            <w:r>
               <w:rPr>
                 <w:b/>
                 <w:lang w:val="en-US"/>
               </w:rPr>
-            </w:pPr>
-            <w:r>
-              <w:rPr>
-                <w:b/>
-                <w:lang w:val="en-US"/>
-              </w:rPr>
-              <w:t>(</w:t>
+              <w:t xml:space="preserve"> (</w:t>
             </w:r>
             <w:proofErr w:type="spellStart"/>
             <w:r>
@@ -548,9 +452,6 @@
         </w:tc>
       </w:tr>
       <w:tr>
-        <w:trPr>
-          <w:tblHeader/>
-        </w:trPr>
         <w:tc>
           <w:tcPr>
             <w:tcW w:w="215" w:type="pct"/>
@@ -570,6 +471,7 @@
           <w:tcPr>
             <w:tcW w:w="2106" w:type="pct"/>
             <w:vMerge/>
+            <w:vAlign w:val="center"/>
           </w:tcPr>
           <w:p>
             <w:pPr>
@@ -685,8 +587,13 @@
           <w:tcPr>
             <w:tcW w:w="644" w:type="pct"/>
             <w:vMerge/>
+            <w:vAlign w:val="center"/>
           </w:tcPr>
-          <w:p/>
+          <w:p>
+            <w:pPr>
+              <w:jc w:val="center"/>
+            </w:pPr>
+          </w:p>
         </w:tc>
         <w:tc>
           <w:tcPr>
@@ -720,7 +627,6 @@
         <w:tc>
           <w:tcPr>
             <w:tcW w:w="2106" w:type="pct"/>
-            <w:vAlign w:val="center"/>
           </w:tcPr>
           <w:p>
             <w:pPr>
@@ -790,7 +696,7 @@
               <w:rPr>
                 <w:lang w:val="en-US"/>
               </w:rPr>
-              <w:t>và</w:t>
+              <w:t>của</w:t>
             </w:r>
             <w:proofErr w:type="spellEnd"/>
             <w:r>
@@ -804,7 +710,7 @@
               <w:rPr>
                 <w:lang w:val="en-US"/>
               </w:rPr>
-              <w:t>vệ</w:t>
+              <w:t>các</w:t>
             </w:r>
             <w:proofErr w:type="spellEnd"/>
             <w:r>
@@ -818,13 +724,27 @@
               <w:rPr>
                 <w:lang w:val="en-US"/>
               </w:rPr>
-              <w:t>sinh</w:t>
+              <w:t>máy</w:t>
             </w:r>
             <w:proofErr w:type="spellEnd"/>
             <w:r>
               <w:rPr>
                 <w:lang w:val="en-US"/>
               </w:rPr>
+              <w:t xml:space="preserve"> 61П, 16П, </w:t>
+            </w:r>
+            <w:proofErr w:type="spellStart"/>
+            <w:r>
+              <w:rPr>
+                <w:lang w:val="en-US"/>
+              </w:rPr>
+              <w:t>các</w:t>
+            </w:r>
+            <w:proofErr w:type="spellEnd"/>
+            <w:r>
+              <w:rPr>
+                <w:lang w:val="en-US"/>
+              </w:rPr>
               <w:t xml:space="preserve"> </w:t>
             </w:r>
             <w:proofErr w:type="spellStart"/>
@@ -832,7 +752,7 @@
               <w:rPr>
                 <w:lang w:val="en-US"/>
               </w:rPr>
-              <w:t>các</w:t>
+              <w:t>đường</w:t>
             </w:r>
             <w:proofErr w:type="spellEnd"/>
             <w:r>
@@ -846,99 +766,9 @@
               <w:rPr>
                 <w:lang w:val="en-US"/>
               </w:rPr>
-              <w:t>thiết</w:t>
+              <w:t>cáp</w:t>
             </w:r>
             <w:proofErr w:type="spellEnd"/>
-            <w:r>
-              <w:rPr>
-                <w:lang w:val="en-US"/>
-              </w:rPr>
-              <w:t xml:space="preserve"> </w:t>
-            </w:r>
-            <w:proofErr w:type="spellStart"/>
-            <w:r>
-              <w:rPr>
-                <w:lang w:val="en-US"/>
-              </w:rPr>
-              <w:t>bị</w:t>
-            </w:r>
-            <w:proofErr w:type="spellEnd"/>
-            <w:r>
-              <w:rPr>
-                <w:lang w:val="en-US"/>
-              </w:rPr>
-              <w:t xml:space="preserve">, </w:t>
-            </w:r>
-            <w:proofErr w:type="spellStart"/>
-            <w:r>
-              <w:rPr>
-                <w:lang w:val="en-US"/>
-              </w:rPr>
-              <w:t>các</w:t>
-            </w:r>
-            <w:proofErr w:type="spellEnd"/>
-            <w:r>
-              <w:rPr>
-                <w:lang w:val="en-US"/>
-              </w:rPr>
-              <w:t xml:space="preserve"> </w:t>
-            </w:r>
-            <w:proofErr w:type="spellStart"/>
-            <w:r>
-              <w:rPr>
-                <w:lang w:val="en-US"/>
-              </w:rPr>
-              <w:t>khối</w:t>
-            </w:r>
-            <w:proofErr w:type="spellEnd"/>
-            <w:r>
-              <w:rPr>
-                <w:lang w:val="en-US"/>
-              </w:rPr>
-              <w:t xml:space="preserve"> </w:t>
-            </w:r>
-            <w:proofErr w:type="spellStart"/>
-            <w:r>
-              <w:rPr>
-                <w:lang w:val="en-US"/>
-              </w:rPr>
-              <w:t>máy</w:t>
-            </w:r>
-            <w:proofErr w:type="spellEnd"/>
-            <w:r>
-              <w:rPr>
-                <w:lang w:val="en-US"/>
-              </w:rPr>
-              <w:t xml:space="preserve"> (</w:t>
-            </w:r>
-            <w:proofErr w:type="spellStart"/>
-            <w:r>
-              <w:rPr>
-                <w:lang w:val="en-US"/>
-              </w:rPr>
-              <w:t>không</w:t>
-            </w:r>
-            <w:proofErr w:type="spellEnd"/>
-            <w:r>
-              <w:rPr>
-                <w:lang w:val="en-US"/>
-              </w:rPr>
-              <w:t xml:space="preserve"> </w:t>
-            </w:r>
-            <w:proofErr w:type="spellStart"/>
-            <w:r>
-              <w:rPr>
-                <w:lang w:val="en-US"/>
-              </w:rPr>
-              <w:t>mở</w:t>
-            </w:r>
-            <w:proofErr w:type="spellEnd"/>
-            <w:r>
-              <w:rPr>
-                <w:lang w:val="en-US"/>
-              </w:rPr>
-              <w:t>)</w:t>
-            </w:r>
           </w:p>
         </w:tc>
         <w:tc>
@@ -969,6 +799,9 @@
           <w:p>
             <w:pPr>
               <w:jc w:val="center"/>
+              <w:rPr>
+                <w:lang w:val="en-US"/>
+              </w:rPr>
             </w:pPr>
             <w:r>
               <w:rPr>
@@ -1002,8 +835,58 @@
               <w:rPr>
                 <w:lang w:val="en-US"/>
               </w:rPr>
-              <w:t xml:space="preserve"> pin</w:t>
-            </w:r>
+              <w:t xml:space="preserve"> pin, </w:t>
+            </w:r>
+            <w:proofErr w:type="spellStart"/>
+            <w:r>
+              <w:rPr>
+                <w:lang w:val="en-US"/>
+              </w:rPr>
+              <w:t>cờ</w:t>
+            </w:r>
+            <w:proofErr w:type="spellEnd"/>
+            <w:r>
+              <w:rPr>
+                <w:lang w:val="en-US"/>
+              </w:rPr>
+              <w:t xml:space="preserve"> </w:t>
+            </w:r>
+            <w:proofErr w:type="spellStart"/>
+            <w:r>
+              <w:rPr>
+                <w:lang w:val="en-US"/>
+              </w:rPr>
+              <w:t>lê</w:t>
+            </w:r>
+            <w:proofErr w:type="spellEnd"/>
+            <w:r>
+              <w:rPr>
+                <w:lang w:val="en-US"/>
+              </w:rPr>
+              <w:t xml:space="preserve">, </w:t>
+            </w:r>
+            <w:proofErr w:type="spellStart"/>
+            <w:r>
+              <w:rPr>
+                <w:lang w:val="en-US"/>
+              </w:rPr>
+              <w:t>tua</w:t>
+            </w:r>
+            <w:proofErr w:type="spellEnd"/>
+            <w:r>
+              <w:rPr>
+                <w:lang w:val="en-US"/>
+              </w:rPr>
+              <w:t xml:space="preserve"> </w:t>
+            </w:r>
+            <w:proofErr w:type="spellStart"/>
+            <w:r>
+              <w:rPr>
+                <w:lang w:val="en-US"/>
+              </w:rPr>
+              <w:t>vít</w:t>
+            </w:r>
+            <w:proofErr w:type="spellEnd"/>
           </w:p>
         </w:tc>
         <w:tc>
@@ -1044,8 +927,16 @@
               <w:rPr>
                 <w:lang w:val="en-US"/>
               </w:rPr>
-              <w:t xml:space="preserve">, </w:t>
-            </w:r>
+              <w:t>,</w:t>
+            </w:r>
+          </w:p>
+          <w:p>
+            <w:pPr>
+              <w:jc w:val="center"/>
+              <w:rPr>
+                <w:lang w:val="en-US"/>
+              </w:rPr>
+            </w:pPr>
             <w:proofErr w:type="spellStart"/>
             <w:r>
               <w:rPr>
@@ -1065,7 +956,7 @@
               <w:rPr>
                 <w:lang w:val="en-US"/>
               </w:rPr>
-              <w:t>bông</w:t>
+              <w:t>mềm</w:t>
             </w:r>
             <w:proofErr w:type="spellEnd"/>
           </w:p>
@@ -1158,34 +1049,6 @@
                 <w:lang w:val="en-US"/>
               </w:rPr>
               <w:t>khí</w:t>
-            </w:r>
-            <w:proofErr w:type="spellEnd"/>
-            <w:r>
-              <w:rPr>
-                <w:lang w:val="en-US"/>
-              </w:rPr>
-              <w:t xml:space="preserve">, </w:t>
-            </w:r>
-            <w:proofErr w:type="spellStart"/>
-            <w:r>
-              <w:rPr>
-                <w:lang w:val="en-US"/>
-              </w:rPr>
-              <w:t>sạch</w:t>
-            </w:r>
-            <w:proofErr w:type="spellEnd"/>
-            <w:r>
-              <w:rPr>
-                <w:lang w:val="en-US"/>
-              </w:rPr>
-              <w:t xml:space="preserve"> </w:t>
-            </w:r>
-            <w:proofErr w:type="spellStart"/>
-            <w:r>
-              <w:rPr>
-                <w:lang w:val="en-US"/>
-              </w:rPr>
-              <w:t>sẽ</w:t>
             </w:r>
             <w:proofErr w:type="spellEnd"/>
           </w:p>
@@ -1226,7 +1089,6 @@
         <w:tc>
           <w:tcPr>
             <w:tcW w:w="2106" w:type="pct"/>
-            <w:vAlign w:val="center"/>
           </w:tcPr>
           <w:p>
             <w:pPr>
@@ -1235,89 +1097,8 @@
                 <w:lang w:val="en-US"/>
               </w:rPr>
             </w:pPr>
-            <w:proofErr w:type="spellStart"/>
-            <w:r>
-              <w:rPr>
-                <w:lang w:val="en-US"/>
-              </w:rPr>
-              <w:t>Kiểm</w:t>
-            </w:r>
-            <w:proofErr w:type="spellEnd"/>
-            <w:r>
-              <w:rPr>
-                <w:lang w:val="en-US"/>
-              </w:rPr>
-              <w:t xml:space="preserve"> </w:t>
-            </w:r>
-            <w:proofErr w:type="spellStart"/>
-            <w:r>
-              <w:rPr>
-                <w:lang w:val="en-US"/>
-              </w:rPr>
-              <w:t>tra</w:t>
-            </w:r>
-            <w:proofErr w:type="spellEnd"/>
-            <w:r>
-              <w:rPr>
-                <w:lang w:val="en-US"/>
-              </w:rPr>
-              <w:t xml:space="preserve"> </w:t>
-            </w:r>
-            <w:proofErr w:type="spellStart"/>
-            <w:r>
-              <w:rPr>
-                <w:lang w:val="en-US"/>
-              </w:rPr>
-              <w:t>hệ</w:t>
-            </w:r>
-            <w:proofErr w:type="spellEnd"/>
-            <w:r>
-              <w:rPr>
-                <w:lang w:val="en-US"/>
-              </w:rPr>
-              <w:t xml:space="preserve"> </w:t>
-            </w:r>
-            <w:proofErr w:type="spellStart"/>
-            <w:r>
-              <w:rPr>
-                <w:lang w:val="en-US"/>
-              </w:rPr>
-              <w:t>thống</w:t>
-            </w:r>
-            <w:proofErr w:type="spellEnd"/>
-            <w:r>
-              <w:rPr>
-                <w:lang w:val="en-US"/>
-              </w:rPr>
-              <w:t xml:space="preserve"> </w:t>
-            </w:r>
-            <w:proofErr w:type="spellStart"/>
-            <w:r>
-              <w:rPr>
-                <w:lang w:val="en-US"/>
-              </w:rPr>
-              <w:t>nguồn</w:t>
-            </w:r>
-            <w:proofErr w:type="spellEnd"/>
-            <w:r>
-              <w:rPr>
-                <w:lang w:val="en-US"/>
-              </w:rPr>
-              <w:t xml:space="preserve"> </w:t>
-            </w:r>
-            <w:proofErr w:type="spellStart"/>
-            <w:r>
-              <w:rPr>
-                <w:lang w:val="en-US"/>
-              </w:rPr>
-              <w:t>điện</w:t>
-            </w:r>
-            <w:proofErr w:type="spellEnd"/>
-            <w:r>
-              <w:rPr>
-                <w:lang w:val="en-US"/>
-              </w:rPr>
-              <w:t>:</w:t>
+            <w:r>
+              <w:t>Lau chùi bụi bẩn, hơi ẩm ở các phần bên ngoài của máy</w:t>
             </w:r>
           </w:p>
         </w:tc>
@@ -1330,6 +1111,545 @@
             <w:pPr>
               <w:jc w:val="center"/>
               <w:rPr>
+                <w:lang w:val="en-US"/>
+              </w:rPr>
+            </w:pPr>
+            <w:r>
+              <w:rPr>
+                <w:lang w:val="en-US"/>
+              </w:rPr>
+              <w:t>1</w:t>
+            </w:r>
+          </w:p>
+        </w:tc>
+        <w:tc>
+          <w:tcPr>
+            <w:tcW w:w="469" w:type="pct"/>
+            <w:vAlign w:val="center"/>
+          </w:tcPr>
+          <w:p>
+            <w:pPr>
+              <w:jc w:val="center"/>
+              <w:rPr>
+                <w:lang w:val="en-US"/>
+              </w:rPr>
+            </w:pPr>
+            <w:r>
+              <w:rPr>
+                <w:lang w:val="en-US"/>
+              </w:rPr>
+              <w:t>30</w:t>
+            </w:r>
+          </w:p>
+        </w:tc>
+        <w:tc>
+          <w:tcPr>
+            <w:tcW w:w="445" w:type="pct"/>
+            <w:vAlign w:val="center"/>
+          </w:tcPr>
+          <w:p>
+            <w:pPr>
+              <w:jc w:val="center"/>
+              <w:rPr>
+                <w:lang w:val="en-US"/>
+              </w:rPr>
+            </w:pPr>
+            <w:proofErr w:type="spellStart"/>
+            <w:r>
+              <w:rPr>
+                <w:lang w:val="en-US"/>
+              </w:rPr>
+              <w:t>Đèn</w:t>
+            </w:r>
+            <w:proofErr w:type="spellEnd"/>
+            <w:r>
+              <w:rPr>
+                <w:lang w:val="en-US"/>
+              </w:rPr>
+              <w:t xml:space="preserve"> pin</w:t>
+            </w:r>
+          </w:p>
+        </w:tc>
+        <w:tc>
+          <w:tcPr>
+            <w:tcW w:w="481" w:type="pct"/>
+            <w:vAlign w:val="center"/>
+          </w:tcPr>
+          <w:p>
+            <w:pPr>
+              <w:jc w:val="center"/>
+            </w:pPr>
+            <w:proofErr w:type="spellStart"/>
+            <w:r>
+              <w:rPr>
+                <w:lang w:val="en-US"/>
+              </w:rPr>
+              <w:t>Găng</w:t>
+            </w:r>
+            <w:proofErr w:type="spellEnd"/>
+            <w:r>
+              <w:rPr>
+                <w:lang w:val="en-US"/>
+              </w:rPr>
+              <w:t xml:space="preserve"> </w:t>
+            </w:r>
+            <w:proofErr w:type="spellStart"/>
+            <w:r>
+              <w:rPr>
+                <w:lang w:val="en-US"/>
+              </w:rPr>
+              <w:t>tay</w:t>
+            </w:r>
+            <w:proofErr w:type="spellEnd"/>
+            <w:r>
+              <w:rPr>
+                <w:lang w:val="en-US"/>
+              </w:rPr>
+              <w:t xml:space="preserve">, </w:t>
+            </w:r>
+            <w:proofErr w:type="spellStart"/>
+            <w:r>
+              <w:rPr>
+                <w:lang w:val="en-US"/>
+              </w:rPr>
+              <w:t>vải</w:t>
+            </w:r>
+            <w:proofErr w:type="spellEnd"/>
+            <w:r>
+              <w:rPr>
+                <w:lang w:val="en-US"/>
+              </w:rPr>
+              <w:t xml:space="preserve"> </w:t>
+            </w:r>
+            <w:proofErr w:type="spellStart"/>
+            <w:r>
+              <w:rPr>
+                <w:lang w:val="en-US"/>
+              </w:rPr>
+              <w:t>mềm</w:t>
+            </w:r>
+            <w:proofErr w:type="spellEnd"/>
+          </w:p>
+        </w:tc>
+        <w:tc>
+          <w:tcPr>
+            <w:tcW w:w="644" w:type="pct"/>
+            <w:vAlign w:val="center"/>
+          </w:tcPr>
+          <w:p>
+            <w:pPr>
+              <w:jc w:val="center"/>
+              <w:rPr>
+                <w:lang w:val="en-US"/>
+              </w:rPr>
+            </w:pPr>
+            <w:proofErr w:type="spellStart"/>
+            <w:r>
+              <w:rPr>
+                <w:lang w:val="en-US"/>
+              </w:rPr>
+              <w:t>Sạch</w:t>
+            </w:r>
+            <w:proofErr w:type="spellEnd"/>
+            <w:r>
+              <w:rPr>
+                <w:lang w:val="en-US"/>
+              </w:rPr>
+              <w:t xml:space="preserve"> </w:t>
+            </w:r>
+            <w:proofErr w:type="spellStart"/>
+            <w:r>
+              <w:rPr>
+                <w:lang w:val="en-US"/>
+              </w:rPr>
+              <w:t>sẽ</w:t>
+            </w:r>
+            <w:proofErr w:type="spellEnd"/>
+          </w:p>
+        </w:tc>
+        <w:tc>
+          <w:tcPr>
+            <w:tcW w:w="308" w:type="pct"/>
+          </w:tcPr>
+          <w:p/>
+        </w:tc>
+      </w:tr>
+      <w:tr>
+        <w:tc>
+          <w:tcPr>
+            <w:tcW w:w="215" w:type="pct"/>
+            <w:vAlign w:val="center"/>
+          </w:tcPr>
+          <w:p>
+            <w:pPr>
+              <w:jc w:val="center"/>
+              <w:rPr>
+                <w:lang w:val="en-US"/>
+              </w:rPr>
+            </w:pPr>
+            <w:r>
+              <w:rPr>
+                <w:lang w:val="en-US"/>
+              </w:rPr>
+              <w:t>3</w:t>
+            </w:r>
+          </w:p>
+        </w:tc>
+        <w:tc>
+          <w:tcPr>
+            <w:tcW w:w="2106" w:type="pct"/>
+          </w:tcPr>
+          <w:p>
+            <w:pPr>
+              <w:pStyle w:val="ListParagraph"/>
+              <w:numPr>
+                <w:ilvl w:val="0"/>
+                <w:numId w:val="3"/>
+              </w:numPr>
+              <w:tabs>
+                <w:tab w:val="left" w:pos="290"/>
+              </w:tabs>
+              <w:spacing w:line="240" w:lineRule="auto"/>
+              <w:ind w:left="0" w:firstLine="0"/>
+              <w:jc w:val="both"/>
+            </w:pPr>
+            <w:r>
+              <w:t>Mở nắp ngoài của máy có ghi chữ “КОНТРОЛЬ”, tiến hành kiểm tra theo nội dung 5.6 trong tài liệu “Hướng dẫn sử dụng”</w:t>
+            </w:r>
+          </w:p>
+          <w:p>
+            <w:pPr>
+              <w:pStyle w:val="ListParagraph"/>
+              <w:numPr>
+                <w:ilvl w:val="0"/>
+                <w:numId w:val="3"/>
+              </w:numPr>
+              <w:tabs>
+                <w:tab w:val="left" w:pos="290"/>
+              </w:tabs>
+              <w:spacing w:line="240" w:lineRule="auto"/>
+              <w:ind w:left="0" w:firstLine="0"/>
+              <w:jc w:val="both"/>
+            </w:pPr>
+            <w:r>
+              <w:t>Ấn nút “КОНТРОЛЬ”, lúc này cần phải sáng bảng đèn “+15B”, “-15B” và “THIẾT LẬP CHẾ ĐỘ TRỰC CANH” (УСТАНОВЛЕН РЕЖИМ ДЕРУЖНЫЙ) hoặc “THIẾT LẬP CHẾ ĐỘ CHƯƠNG TRÌNH - TRỰC CANH” (УСТАНОВЛЕН РЕЖИМ ПРОГРАММА - ДЕРУЖНЫЙ)</w:t>
+            </w:r>
+          </w:p>
+        </w:tc>
+        <w:tc>
+          <w:tcPr>
+            <w:tcW w:w="332" w:type="pct"/>
+            <w:vAlign w:val="center"/>
+          </w:tcPr>
+          <w:p>
+            <w:pPr>
+              <w:jc w:val="center"/>
+              <w:rPr>
+                <w:lang w:val="en-US"/>
+              </w:rPr>
+            </w:pPr>
+            <w:r>
+              <w:rPr>
+                <w:lang w:val="en-US"/>
+              </w:rPr>
+              <w:t>2</w:t>
+            </w:r>
+          </w:p>
+        </w:tc>
+        <w:tc>
+          <w:tcPr>
+            <w:tcW w:w="469" w:type="pct"/>
+            <w:vAlign w:val="center"/>
+          </w:tcPr>
+          <w:p>
+            <w:pPr>
+              <w:jc w:val="center"/>
+              <w:rPr>
+                <w:lang w:val="en-US"/>
+              </w:rPr>
+            </w:pPr>
+            <w:r>
+              <w:rPr>
+                <w:lang w:val="en-US"/>
+              </w:rPr>
+              <w:t>60</w:t>
+            </w:r>
+          </w:p>
+        </w:tc>
+        <w:tc>
+          <w:tcPr>
+            <w:tcW w:w="445" w:type="pct"/>
+            <w:vAlign w:val="center"/>
+          </w:tcPr>
+          <w:p>
+            <w:pPr>
+              <w:jc w:val="center"/>
+              <w:rPr>
+                <w:lang w:val="en-US"/>
+              </w:rPr>
+            </w:pPr>
+            <w:proofErr w:type="spellStart"/>
+            <w:r>
+              <w:rPr>
+                <w:lang w:val="en-US"/>
+              </w:rPr>
+              <w:t>Cờ</w:t>
+            </w:r>
+            <w:proofErr w:type="spellEnd"/>
+            <w:r>
+              <w:rPr>
+                <w:lang w:val="en-US"/>
+              </w:rPr>
+              <w:t xml:space="preserve"> </w:t>
+            </w:r>
+            <w:proofErr w:type="spellStart"/>
+            <w:r>
+              <w:rPr>
+                <w:lang w:val="en-US"/>
+              </w:rPr>
+              <w:t>lê</w:t>
+            </w:r>
+            <w:proofErr w:type="spellEnd"/>
+            <w:r>
+              <w:rPr>
+                <w:lang w:val="en-US"/>
+              </w:rPr>
+              <w:t>,</w:t>
+            </w:r>
+          </w:p>
+          <w:p>
+            <w:pPr>
+              <w:jc w:val="center"/>
+            </w:pPr>
+            <w:proofErr w:type="spellStart"/>
+            <w:r>
+              <w:rPr>
+                <w:lang w:val="en-US"/>
+              </w:rPr>
+              <w:t>tua</w:t>
+            </w:r>
+            <w:proofErr w:type="spellEnd"/>
+            <w:r>
+              <w:rPr>
+                <w:lang w:val="en-US"/>
+              </w:rPr>
+              <w:t xml:space="preserve"> </w:t>
+            </w:r>
+            <w:proofErr w:type="spellStart"/>
+            <w:r>
+              <w:rPr>
+                <w:lang w:val="en-US"/>
+              </w:rPr>
+              <w:t>vít</w:t>
+            </w:r>
+            <w:proofErr w:type="spellEnd"/>
+            <w:r>
+              <w:rPr>
+                <w:lang w:val="en-US"/>
+              </w:rPr>
+              <w:t xml:space="preserve">, </w:t>
+            </w:r>
+            <w:proofErr w:type="spellStart"/>
+            <w:r>
+              <w:rPr>
+                <w:lang w:val="en-US"/>
+              </w:rPr>
+              <w:t>đèn</w:t>
+            </w:r>
+            <w:proofErr w:type="spellEnd"/>
+            <w:r>
+              <w:rPr>
+                <w:lang w:val="en-US"/>
+              </w:rPr>
+              <w:t xml:space="preserve"> pin</w:t>
+            </w:r>
+          </w:p>
+        </w:tc>
+        <w:tc>
+          <w:tcPr>
+            <w:tcW w:w="481" w:type="pct"/>
+            <w:vAlign w:val="center"/>
+          </w:tcPr>
+          <w:p>
+            <w:pPr>
+              <w:jc w:val="center"/>
+              <w:rPr>
+                <w:lang w:val="en-US"/>
+              </w:rPr>
+            </w:pPr>
+            <w:r>
+              <w:rPr>
+                <w:lang w:val="en-US"/>
+              </w:rPr>
+              <w:t>//</w:t>
+            </w:r>
+          </w:p>
+        </w:tc>
+        <w:tc>
+          <w:tcPr>
+            <w:tcW w:w="644" w:type="pct"/>
+            <w:vAlign w:val="center"/>
+          </w:tcPr>
+          <w:p>
+            <w:pPr>
+              <w:jc w:val="center"/>
+            </w:pPr>
+            <w:proofErr w:type="spellStart"/>
+            <w:r>
+              <w:rPr>
+                <w:lang w:val="en-US"/>
+              </w:rPr>
+              <w:t>Hoạt</w:t>
+            </w:r>
+            <w:proofErr w:type="spellEnd"/>
+            <w:r>
+              <w:rPr>
+                <w:lang w:val="en-US"/>
+              </w:rPr>
+              <w:t xml:space="preserve"> </w:t>
+            </w:r>
+            <w:proofErr w:type="spellStart"/>
+            <w:r>
+              <w:rPr>
+                <w:lang w:val="en-US"/>
+              </w:rPr>
+              <w:t>động</w:t>
+            </w:r>
+            <w:proofErr w:type="spellEnd"/>
+            <w:r>
+              <w:rPr>
+                <w:lang w:val="en-US"/>
+              </w:rPr>
+              <w:t xml:space="preserve"> </w:t>
+            </w:r>
+            <w:proofErr w:type="spellStart"/>
+            <w:r>
+              <w:rPr>
+                <w:lang w:val="en-US"/>
+              </w:rPr>
+              <w:t>bình</w:t>
+            </w:r>
+            <w:proofErr w:type="spellEnd"/>
+            <w:r>
+              <w:rPr>
+                <w:lang w:val="en-US"/>
+              </w:rPr>
+              <w:t xml:space="preserve"> </w:t>
+            </w:r>
+            <w:proofErr w:type="spellStart"/>
+            <w:r>
+              <w:rPr>
+                <w:lang w:val="en-US"/>
+              </w:rPr>
+              <w:t>thường</w:t>
+            </w:r>
+            <w:proofErr w:type="spellEnd"/>
+            <w:r>
+              <w:rPr>
+                <w:lang w:val="en-US"/>
+              </w:rPr>
+              <w:t xml:space="preserve"> </w:t>
+            </w:r>
+            <w:proofErr w:type="spellStart"/>
+            <w:r>
+              <w:rPr>
+                <w:lang w:val="en-US"/>
+              </w:rPr>
+              <w:t>không</w:t>
+            </w:r>
+            <w:proofErr w:type="spellEnd"/>
+            <w:r>
+              <w:rPr>
+                <w:lang w:val="en-US"/>
+              </w:rPr>
+              <w:t xml:space="preserve"> </w:t>
+            </w:r>
+            <w:proofErr w:type="spellStart"/>
+            <w:r>
+              <w:rPr>
+                <w:lang w:val="en-US"/>
+              </w:rPr>
+              <w:t>báo</w:t>
+            </w:r>
+            <w:proofErr w:type="spellEnd"/>
+            <w:r>
+              <w:rPr>
+                <w:lang w:val="en-US"/>
+              </w:rPr>
+              <w:t xml:space="preserve"> </w:t>
+            </w:r>
+            <w:proofErr w:type="spellStart"/>
+            <w:r>
+              <w:rPr>
+                <w:lang w:val="en-US"/>
+              </w:rPr>
+              <w:t>lỗi</w:t>
+            </w:r>
+            <w:proofErr w:type="spellEnd"/>
+          </w:p>
+        </w:tc>
+        <w:tc>
+          <w:tcPr>
+            <w:tcW w:w="308" w:type="pct"/>
+          </w:tcPr>
+          <w:p/>
+        </w:tc>
+      </w:tr>
+      <w:tr>
+        <w:tc>
+          <w:tcPr>
+            <w:tcW w:w="215" w:type="pct"/>
+            <w:vAlign w:val="center"/>
+          </w:tcPr>
+          <w:p>
+            <w:pPr>
+              <w:jc w:val="center"/>
+              <w:rPr>
+                <w:lang w:val="en-US"/>
+              </w:rPr>
+            </w:pPr>
+            <w:r>
+              <w:rPr>
+                <w:lang w:val="en-US"/>
+              </w:rPr>
+              <w:t>4</w:t>
+            </w:r>
+          </w:p>
+        </w:tc>
+        <w:tc>
+          <w:tcPr>
+            <w:tcW w:w="2106" w:type="pct"/>
+            <w:vAlign w:val="center"/>
+          </w:tcPr>
+          <w:p>
+            <w:pPr>
+              <w:jc w:val="both"/>
+              <w:rPr>
+                <w:b/>
+                <w:lang w:val="en-US"/>
+              </w:rPr>
+            </w:pPr>
+            <w:proofErr w:type="spellStart"/>
+            <w:r>
+              <w:rPr>
+                <w:b/>
+                <w:lang w:val="en-US"/>
+              </w:rPr>
+              <w:t>Tổng</w:t>
+            </w:r>
+            <w:proofErr w:type="spellEnd"/>
+          </w:p>
+        </w:tc>
+        <w:tc>
+          <w:tcPr>
+            <w:tcW w:w="332" w:type="pct"/>
+            <w:vAlign w:val="center"/>
+          </w:tcPr>
+          <w:p>
+            <w:pPr>
+              <w:jc w:val="center"/>
+              <w:rPr>
+                <w:b/>
                 <w:lang w:val="en-US"/>
               </w:rPr>
             </w:pPr>
@@ -1343,7 +1663,18 @@
           <w:p>
             <w:pPr>
               <w:jc w:val="center"/>
+              <w:rPr>
+                <w:b/>
+                <w:lang w:val="en-US"/>
+              </w:rPr>
             </w:pPr>
+            <w:r>
+              <w:rPr>
+                <w:b/>
+                <w:lang w:val="en-US"/>
+              </w:rPr>
+              <w:t>120</w:t>
+            </w:r>
           </w:p>
         </w:tc>
         <w:tc>
@@ -1386,2218 +1717,7 @@
           <w:p/>
         </w:tc>
       </w:tr>
-      <w:tr>
-        <w:tc>
-          <w:tcPr>
-            <w:tcW w:w="215" w:type="pct"/>
-            <w:vAlign w:val="center"/>
-          </w:tcPr>
-          <w:p>
-            <w:pPr>
-              <w:jc w:val="center"/>
-              <w:rPr>
-                <w:lang w:val="en-US"/>
-              </w:rPr>
-            </w:pPr>
-            <w:r>
-              <w:rPr>
-                <w:lang w:val="en-US"/>
-              </w:rPr>
-              <w:t>2.1</w:t>
-            </w:r>
-          </w:p>
-        </w:tc>
-        <w:tc>
-          <w:tcPr>
-            <w:tcW w:w="2106" w:type="pct"/>
-            <w:vAlign w:val="center"/>
-          </w:tcPr>
-          <w:p>
-            <w:pPr>
-              <w:jc w:val="both"/>
-              <w:rPr>
-                <w:lang w:val="en-US"/>
-              </w:rPr>
-            </w:pPr>
-            <w:proofErr w:type="spellStart"/>
-            <w:r>
-              <w:rPr>
-                <w:lang w:val="en-US"/>
-              </w:rPr>
-              <w:t>Chuẩn</w:t>
-            </w:r>
-            <w:proofErr w:type="spellEnd"/>
-            <w:r>
-              <w:rPr>
-                <w:lang w:val="en-US"/>
-              </w:rPr>
-              <w:t xml:space="preserve"> </w:t>
-            </w:r>
-            <w:proofErr w:type="spellStart"/>
-            <w:r>
-              <w:rPr>
-                <w:lang w:val="en-US"/>
-              </w:rPr>
-              <w:t>bị</w:t>
-            </w:r>
-            <w:proofErr w:type="spellEnd"/>
-            <w:r>
-              <w:rPr>
-                <w:lang w:val="en-US"/>
-              </w:rPr>
-              <w:t xml:space="preserve"> </w:t>
-            </w:r>
-            <w:proofErr w:type="spellStart"/>
-            <w:r>
-              <w:rPr>
-                <w:lang w:val="en-US"/>
-              </w:rPr>
-              <w:t>các</w:t>
-            </w:r>
-            <w:proofErr w:type="spellEnd"/>
-            <w:r>
-              <w:rPr>
-                <w:lang w:val="en-US"/>
-              </w:rPr>
-              <w:t xml:space="preserve"> </w:t>
-            </w:r>
-            <w:proofErr w:type="spellStart"/>
-            <w:r>
-              <w:rPr>
-                <w:lang w:val="en-US"/>
-              </w:rPr>
-              <w:t>thiết</w:t>
-            </w:r>
-            <w:proofErr w:type="spellEnd"/>
-            <w:r>
-              <w:rPr>
-                <w:lang w:val="en-US"/>
-              </w:rPr>
-              <w:t xml:space="preserve"> </w:t>
-            </w:r>
-            <w:proofErr w:type="spellStart"/>
-            <w:r>
-              <w:rPr>
-                <w:lang w:val="en-US"/>
-              </w:rPr>
-              <w:t>bị</w:t>
-            </w:r>
-            <w:proofErr w:type="spellEnd"/>
-            <w:r>
-              <w:rPr>
-                <w:lang w:val="en-US"/>
-              </w:rPr>
-              <w:t xml:space="preserve"> </w:t>
-            </w:r>
-            <w:proofErr w:type="spellStart"/>
-            <w:r>
-              <w:rPr>
-                <w:lang w:val="en-US"/>
-              </w:rPr>
-              <w:t>nguồn</w:t>
-            </w:r>
-            <w:proofErr w:type="spellEnd"/>
-            <w:r>
-              <w:rPr>
-                <w:lang w:val="en-US"/>
-              </w:rPr>
-              <w:t xml:space="preserve"> </w:t>
-            </w:r>
-            <w:proofErr w:type="spellStart"/>
-            <w:r>
-              <w:rPr>
-                <w:lang w:val="en-US"/>
-              </w:rPr>
-              <w:t>để</w:t>
-            </w:r>
-            <w:proofErr w:type="spellEnd"/>
-            <w:r>
-              <w:rPr>
-                <w:lang w:val="en-US"/>
-              </w:rPr>
-              <w:t xml:space="preserve"> </w:t>
-            </w:r>
-            <w:proofErr w:type="spellStart"/>
-            <w:r>
-              <w:rPr>
-                <w:lang w:val="en-US"/>
-              </w:rPr>
-              <w:t>làm</w:t>
-            </w:r>
-            <w:proofErr w:type="spellEnd"/>
-            <w:r>
-              <w:rPr>
-                <w:lang w:val="en-US"/>
-              </w:rPr>
-              <w:t xml:space="preserve"> </w:t>
-            </w:r>
-            <w:proofErr w:type="spellStart"/>
-            <w:r>
-              <w:rPr>
-                <w:lang w:val="en-US"/>
-              </w:rPr>
-              <w:t>việc</w:t>
-            </w:r>
-            <w:proofErr w:type="spellEnd"/>
-            <w:r>
-              <w:rPr>
-                <w:lang w:val="en-US"/>
-              </w:rPr>
-              <w:t xml:space="preserve">. </w:t>
-            </w:r>
-            <w:proofErr w:type="spellStart"/>
-            <w:r>
-              <w:rPr>
-                <w:lang w:val="en-US"/>
-              </w:rPr>
-              <w:t>Kiểm</w:t>
-            </w:r>
-            <w:proofErr w:type="spellEnd"/>
-            <w:r>
-              <w:rPr>
-                <w:lang w:val="en-US"/>
-              </w:rPr>
-              <w:t xml:space="preserve"> </w:t>
-            </w:r>
-            <w:proofErr w:type="spellStart"/>
-            <w:r>
-              <w:rPr>
-                <w:lang w:val="en-US"/>
-              </w:rPr>
-              <w:t>tra</w:t>
-            </w:r>
-            <w:proofErr w:type="spellEnd"/>
-            <w:r>
-              <w:rPr>
-                <w:lang w:val="en-US"/>
-              </w:rPr>
-              <w:t xml:space="preserve"> </w:t>
-            </w:r>
-            <w:proofErr w:type="spellStart"/>
-            <w:r>
-              <w:rPr>
-                <w:lang w:val="en-US"/>
-              </w:rPr>
-              <w:t>đầy</w:t>
-            </w:r>
-            <w:proofErr w:type="spellEnd"/>
-            <w:r>
-              <w:rPr>
-                <w:lang w:val="en-US"/>
-              </w:rPr>
-              <w:t xml:space="preserve"> </w:t>
-            </w:r>
-            <w:proofErr w:type="spellStart"/>
-            <w:r>
-              <w:rPr>
-                <w:lang w:val="en-US"/>
-              </w:rPr>
-              <w:t>đủ</w:t>
-            </w:r>
-            <w:proofErr w:type="spellEnd"/>
-            <w:r>
-              <w:rPr>
-                <w:lang w:val="en-US"/>
-              </w:rPr>
-              <w:t xml:space="preserve"> </w:t>
-            </w:r>
-            <w:proofErr w:type="spellStart"/>
-            <w:r>
-              <w:rPr>
-                <w:lang w:val="en-US"/>
-              </w:rPr>
-              <w:t>các</w:t>
-            </w:r>
-            <w:proofErr w:type="spellEnd"/>
-            <w:r>
-              <w:rPr>
-                <w:lang w:val="en-US"/>
-              </w:rPr>
-              <w:t xml:space="preserve"> </w:t>
-            </w:r>
-            <w:proofErr w:type="spellStart"/>
-            <w:r>
-              <w:rPr>
-                <w:lang w:val="en-US"/>
-              </w:rPr>
-              <w:t>cầu</w:t>
-            </w:r>
-            <w:proofErr w:type="spellEnd"/>
-            <w:r>
-              <w:rPr>
-                <w:lang w:val="en-US"/>
-              </w:rPr>
-              <w:t xml:space="preserve"> </w:t>
-            </w:r>
-            <w:proofErr w:type="spellStart"/>
-            <w:r>
-              <w:rPr>
-                <w:lang w:val="en-US"/>
-              </w:rPr>
-              <w:t>chì</w:t>
-            </w:r>
-            <w:proofErr w:type="spellEnd"/>
-            <w:r>
-              <w:rPr>
-                <w:lang w:val="en-US"/>
-              </w:rPr>
-              <w:t xml:space="preserve">: </w:t>
-            </w:r>
-            <w:proofErr w:type="spellStart"/>
-            <w:r>
-              <w:rPr>
-                <w:lang w:val="en-US"/>
-              </w:rPr>
-              <w:t>Máy</w:t>
-            </w:r>
-            <w:proofErr w:type="spellEnd"/>
-            <w:r>
-              <w:rPr>
-                <w:lang w:val="en-US"/>
-              </w:rPr>
-              <w:t xml:space="preserve"> 20, </w:t>
-            </w:r>
-            <w:proofErr w:type="spellStart"/>
-            <w:r>
-              <w:rPr>
-                <w:lang w:val="en-US"/>
-              </w:rPr>
-              <w:t>Máy</w:t>
-            </w:r>
-            <w:proofErr w:type="spellEnd"/>
-            <w:r>
-              <w:rPr>
-                <w:lang w:val="en-US"/>
-              </w:rPr>
-              <w:t xml:space="preserve"> 20A </w:t>
-            </w:r>
-            <w:proofErr w:type="spellStart"/>
-            <w:r>
-              <w:rPr>
-                <w:lang w:val="en-US"/>
-              </w:rPr>
-              <w:t>секция</w:t>
-            </w:r>
-            <w:proofErr w:type="spellEnd"/>
-            <w:r>
-              <w:rPr>
-                <w:lang w:val="en-US"/>
-              </w:rPr>
-              <w:t xml:space="preserve"> 1, </w:t>
-            </w:r>
-            <w:proofErr w:type="spellStart"/>
-            <w:r>
-              <w:rPr>
-                <w:lang w:val="en-US"/>
-              </w:rPr>
-              <w:t>Máy</w:t>
-            </w:r>
-            <w:proofErr w:type="spellEnd"/>
-            <w:r>
-              <w:rPr>
-                <w:lang w:val="en-US"/>
-              </w:rPr>
-              <w:t xml:space="preserve"> 20A </w:t>
-            </w:r>
-            <w:proofErr w:type="spellStart"/>
-            <w:r>
-              <w:rPr>
-                <w:lang w:val="en-US"/>
-              </w:rPr>
-              <w:t>секция</w:t>
-            </w:r>
-            <w:proofErr w:type="spellEnd"/>
-            <w:r>
-              <w:rPr>
-                <w:lang w:val="en-US"/>
-              </w:rPr>
-              <w:t xml:space="preserve"> 2, </w:t>
-            </w:r>
-            <w:proofErr w:type="spellStart"/>
-            <w:r>
-              <w:rPr>
-                <w:lang w:val="en-US"/>
-              </w:rPr>
-              <w:t>máy</w:t>
-            </w:r>
-            <w:proofErr w:type="spellEnd"/>
-            <w:r>
-              <w:rPr>
-                <w:lang w:val="en-US"/>
-              </w:rPr>
-              <w:t xml:space="preserve"> 21Б, </w:t>
-            </w:r>
-            <w:proofErr w:type="spellStart"/>
-            <w:r>
-              <w:rPr>
-                <w:lang w:val="en-US"/>
-              </w:rPr>
-              <w:t>máy</w:t>
-            </w:r>
-            <w:proofErr w:type="spellEnd"/>
-            <w:r>
-              <w:rPr>
-                <w:lang w:val="en-US"/>
-              </w:rPr>
-              <w:t xml:space="preserve"> 21</w:t>
-            </w:r>
-          </w:p>
-        </w:tc>
-        <w:tc>
-          <w:tcPr>
-            <w:tcW w:w="332" w:type="pct"/>
-            <w:vAlign w:val="center"/>
-          </w:tcPr>
-          <w:p>
-            <w:pPr>
-              <w:jc w:val="center"/>
-              <w:rPr>
-                <w:lang w:val="en-US"/>
-              </w:rPr>
-            </w:pPr>
-            <w:r>
-              <w:rPr>
-                <w:lang w:val="en-US"/>
-              </w:rPr>
-              <w:t>1</w:t>
-            </w:r>
-          </w:p>
-        </w:tc>
-        <w:tc>
-          <w:tcPr>
-            <w:tcW w:w="469" w:type="pct"/>
-            <w:vAlign w:val="center"/>
-          </w:tcPr>
-          <w:p>
-            <w:pPr>
-              <w:jc w:val="center"/>
-              <w:rPr>
-                <w:lang w:val="en-US"/>
-              </w:rPr>
-            </w:pPr>
-            <w:r>
-              <w:rPr>
-                <w:lang w:val="en-US"/>
-              </w:rPr>
-              <w:t>15</w:t>
-            </w:r>
-          </w:p>
-        </w:tc>
-        <w:tc>
-          <w:tcPr>
-            <w:tcW w:w="445" w:type="pct"/>
-            <w:vAlign w:val="center"/>
-          </w:tcPr>
-          <w:p>
-            <w:pPr>
-              <w:jc w:val="center"/>
-              <w:rPr>
-                <w:lang w:val="en-US"/>
-              </w:rPr>
-            </w:pPr>
-            <w:r>
-              <w:t xml:space="preserve">Đồng hồ </w:t>
-            </w:r>
-            <w:proofErr w:type="spellStart"/>
-            <w:r>
-              <w:rPr>
-                <w:lang w:val="en-US"/>
-              </w:rPr>
-              <w:t>vạn</w:t>
-            </w:r>
-            <w:proofErr w:type="spellEnd"/>
-            <w:r>
-              <w:rPr>
-                <w:lang w:val="en-US"/>
-              </w:rPr>
-              <w:t xml:space="preserve"> </w:t>
-            </w:r>
-            <w:proofErr w:type="spellStart"/>
-            <w:r>
-              <w:rPr>
-                <w:lang w:val="en-US"/>
-              </w:rPr>
-              <w:t>năng</w:t>
-            </w:r>
-            <w:proofErr w:type="spellEnd"/>
-          </w:p>
-        </w:tc>
-        <w:tc>
-          <w:tcPr>
-            <w:tcW w:w="481" w:type="pct"/>
-            <w:vAlign w:val="center"/>
-          </w:tcPr>
-          <w:p>
-            <w:pPr>
-              <w:jc w:val="center"/>
-            </w:pPr>
-            <w:proofErr w:type="spellStart"/>
-            <w:r>
-              <w:rPr>
-                <w:lang w:val="en-US"/>
-              </w:rPr>
-              <w:t>Găng</w:t>
-            </w:r>
-            <w:proofErr w:type="spellEnd"/>
-            <w:r>
-              <w:rPr>
-                <w:lang w:val="en-US"/>
-              </w:rPr>
-              <w:t xml:space="preserve"> </w:t>
-            </w:r>
-            <w:proofErr w:type="spellStart"/>
-            <w:r>
-              <w:rPr>
-                <w:lang w:val="en-US"/>
-              </w:rPr>
-              <w:t>tay</w:t>
-            </w:r>
-            <w:proofErr w:type="spellEnd"/>
-          </w:p>
-        </w:tc>
-        <w:tc>
-          <w:tcPr>
-            <w:tcW w:w="644" w:type="pct"/>
-            <w:vAlign w:val="center"/>
-          </w:tcPr>
-          <w:p>
-            <w:pPr>
-              <w:jc w:val="center"/>
-            </w:pPr>
-            <w:r>
-              <w:t>Đầy đủ các cầu chì</w:t>
-            </w:r>
-          </w:p>
-        </w:tc>
-        <w:tc>
-          <w:tcPr>
-            <w:tcW w:w="308" w:type="pct"/>
-          </w:tcPr>
-          <w:p/>
-        </w:tc>
-      </w:tr>
-      <w:tr>
-        <w:tc>
-          <w:tcPr>
-            <w:tcW w:w="215" w:type="pct"/>
-            <w:vAlign w:val="center"/>
-          </w:tcPr>
-          <w:p>
-            <w:pPr>
-              <w:jc w:val="center"/>
-              <w:rPr>
-                <w:lang w:val="en-US"/>
-              </w:rPr>
-            </w:pPr>
-            <w:r>
-              <w:rPr>
-                <w:lang w:val="en-US"/>
-              </w:rPr>
-              <w:t>2.2</w:t>
-            </w:r>
-          </w:p>
-        </w:tc>
-        <w:tc>
-          <w:tcPr>
-            <w:tcW w:w="2106" w:type="pct"/>
-            <w:vAlign w:val="center"/>
-          </w:tcPr>
-          <w:p>
-            <w:pPr>
-              <w:jc w:val="both"/>
-              <w:rPr>
-                <w:lang w:val="en-US"/>
-              </w:rPr>
-            </w:pPr>
-            <w:proofErr w:type="spellStart"/>
-            <w:r>
-              <w:rPr>
-                <w:lang w:val="en-US"/>
-              </w:rPr>
-              <w:t>Kiểm</w:t>
-            </w:r>
-            <w:proofErr w:type="spellEnd"/>
-            <w:r>
-              <w:rPr>
-                <w:lang w:val="en-US"/>
-              </w:rPr>
-              <w:t xml:space="preserve"> </w:t>
-            </w:r>
-            <w:proofErr w:type="spellStart"/>
-            <w:r>
-              <w:rPr>
-                <w:lang w:val="en-US"/>
-              </w:rPr>
-              <w:t>tra</w:t>
-            </w:r>
-            <w:proofErr w:type="spellEnd"/>
-            <w:r>
-              <w:rPr>
-                <w:lang w:val="en-US"/>
-              </w:rPr>
-              <w:t xml:space="preserve"> </w:t>
-            </w:r>
-            <w:proofErr w:type="spellStart"/>
-            <w:r>
-              <w:rPr>
-                <w:lang w:val="en-US"/>
-              </w:rPr>
-              <w:t>việc</w:t>
-            </w:r>
-            <w:proofErr w:type="spellEnd"/>
-            <w:r>
-              <w:rPr>
-                <w:lang w:val="en-US"/>
-              </w:rPr>
-              <w:t xml:space="preserve"> </w:t>
-            </w:r>
-            <w:proofErr w:type="spellStart"/>
-            <w:r>
-              <w:rPr>
-                <w:lang w:val="en-US"/>
-              </w:rPr>
-              <w:t>hiển</w:t>
-            </w:r>
-            <w:proofErr w:type="spellEnd"/>
-            <w:r>
-              <w:rPr>
-                <w:lang w:val="en-US"/>
-              </w:rPr>
-              <w:t xml:space="preserve"> </w:t>
-            </w:r>
-            <w:proofErr w:type="spellStart"/>
-            <w:r>
-              <w:rPr>
-                <w:lang w:val="en-US"/>
-              </w:rPr>
-              <w:t>thị</w:t>
-            </w:r>
-            <w:proofErr w:type="spellEnd"/>
-            <w:r>
-              <w:rPr>
-                <w:lang w:val="en-US"/>
-              </w:rPr>
-              <w:t xml:space="preserve"> </w:t>
-            </w:r>
-            <w:proofErr w:type="spellStart"/>
-            <w:r>
-              <w:rPr>
-                <w:lang w:val="en-US"/>
-              </w:rPr>
-              <w:t>các</w:t>
-            </w:r>
-            <w:proofErr w:type="spellEnd"/>
-            <w:r>
-              <w:rPr>
-                <w:lang w:val="en-US"/>
-              </w:rPr>
-              <w:t xml:space="preserve"> </w:t>
-            </w:r>
-            <w:proofErr w:type="spellStart"/>
-            <w:r>
-              <w:rPr>
-                <w:lang w:val="en-US"/>
-              </w:rPr>
-              <w:t>đèn</w:t>
-            </w:r>
-            <w:proofErr w:type="spellEnd"/>
-            <w:r>
-              <w:rPr>
-                <w:lang w:val="en-US"/>
-              </w:rPr>
-              <w:t xml:space="preserve"> </w:t>
-            </w:r>
-            <w:proofErr w:type="spellStart"/>
-            <w:r>
-              <w:rPr>
-                <w:lang w:val="en-US"/>
-              </w:rPr>
-              <w:t>khi</w:t>
-            </w:r>
-            <w:proofErr w:type="spellEnd"/>
-            <w:r>
-              <w:rPr>
-                <w:lang w:val="en-US"/>
-              </w:rPr>
-              <w:t xml:space="preserve"> </w:t>
-            </w:r>
-            <w:proofErr w:type="spellStart"/>
-            <w:r>
-              <w:rPr>
-                <w:lang w:val="en-US"/>
-              </w:rPr>
-              <w:t>bật</w:t>
-            </w:r>
-            <w:proofErr w:type="spellEnd"/>
-            <w:r>
-              <w:rPr>
-                <w:lang w:val="en-US"/>
-              </w:rPr>
-              <w:t xml:space="preserve"> </w:t>
-            </w:r>
-            <w:proofErr w:type="spellStart"/>
-            <w:r>
-              <w:rPr>
-                <w:lang w:val="en-US"/>
-              </w:rPr>
-              <w:t>nguồn</w:t>
-            </w:r>
-            <w:proofErr w:type="spellEnd"/>
-            <w:r>
-              <w:rPr>
-                <w:lang w:val="en-US"/>
-              </w:rPr>
-              <w:t xml:space="preserve"> </w:t>
-            </w:r>
-            <w:proofErr w:type="spellStart"/>
-            <w:r>
-              <w:rPr>
-                <w:lang w:val="en-US"/>
-              </w:rPr>
-              <w:t>cho</w:t>
-            </w:r>
-            <w:proofErr w:type="spellEnd"/>
-            <w:r>
-              <w:rPr>
-                <w:lang w:val="en-US"/>
-              </w:rPr>
-              <w:t xml:space="preserve"> </w:t>
-            </w:r>
-            <w:proofErr w:type="spellStart"/>
-            <w:r>
-              <w:rPr>
-                <w:lang w:val="en-US"/>
-              </w:rPr>
-              <w:t>Tổ</w:t>
-            </w:r>
-            <w:proofErr w:type="spellEnd"/>
-            <w:r>
-              <w:rPr>
-                <w:lang w:val="en-US"/>
-              </w:rPr>
-              <w:t xml:space="preserve"> </w:t>
-            </w:r>
-            <w:proofErr w:type="spellStart"/>
-            <w:r>
-              <w:rPr>
-                <w:lang w:val="en-US"/>
-              </w:rPr>
-              <w:t>hợp</w:t>
-            </w:r>
-            <w:proofErr w:type="spellEnd"/>
-            <w:r>
-              <w:rPr>
-                <w:lang w:val="en-US"/>
-              </w:rPr>
-              <w:t xml:space="preserve">: </w:t>
-            </w:r>
-            <w:proofErr w:type="spellStart"/>
-            <w:r>
-              <w:rPr>
-                <w:lang w:val="en-US"/>
-              </w:rPr>
-              <w:t>máy</w:t>
-            </w:r>
-            <w:proofErr w:type="spellEnd"/>
-            <w:r>
-              <w:rPr>
-                <w:lang w:val="en-US"/>
-              </w:rPr>
-              <w:t xml:space="preserve"> 20, </w:t>
-            </w:r>
-            <w:proofErr w:type="spellStart"/>
-            <w:r>
-              <w:rPr>
-                <w:lang w:val="en-US"/>
-              </w:rPr>
-              <w:t>Máy</w:t>
-            </w:r>
-            <w:proofErr w:type="spellEnd"/>
-            <w:r>
-              <w:rPr>
-                <w:lang w:val="en-US"/>
-              </w:rPr>
-              <w:t xml:space="preserve"> 20A </w:t>
-            </w:r>
-            <w:proofErr w:type="spellStart"/>
-            <w:r>
-              <w:rPr>
-                <w:lang w:val="en-US"/>
-              </w:rPr>
-              <w:t>секция</w:t>
-            </w:r>
-            <w:proofErr w:type="spellEnd"/>
-            <w:r>
-              <w:rPr>
-                <w:lang w:val="en-US"/>
-              </w:rPr>
-              <w:t xml:space="preserve"> 1, </w:t>
-            </w:r>
-            <w:proofErr w:type="spellStart"/>
-            <w:r>
-              <w:rPr>
-                <w:lang w:val="en-US"/>
-              </w:rPr>
-              <w:t>Máy</w:t>
-            </w:r>
-            <w:proofErr w:type="spellEnd"/>
-            <w:r>
-              <w:rPr>
-                <w:lang w:val="en-US"/>
-              </w:rPr>
-              <w:t xml:space="preserve"> 20A </w:t>
-            </w:r>
-            <w:proofErr w:type="spellStart"/>
-            <w:r>
-              <w:rPr>
-                <w:lang w:val="en-US"/>
-              </w:rPr>
-              <w:t>секция</w:t>
-            </w:r>
-            <w:proofErr w:type="spellEnd"/>
-            <w:r>
-              <w:rPr>
-                <w:lang w:val="en-US"/>
-              </w:rPr>
-              <w:t xml:space="preserve"> 2, </w:t>
-            </w:r>
-            <w:proofErr w:type="spellStart"/>
-            <w:r>
-              <w:rPr>
-                <w:lang w:val="en-US"/>
-              </w:rPr>
-              <w:t>máy</w:t>
-            </w:r>
-            <w:proofErr w:type="spellEnd"/>
-            <w:r>
-              <w:rPr>
-                <w:lang w:val="en-US"/>
-              </w:rPr>
-              <w:t xml:space="preserve"> 50, </w:t>
-            </w:r>
-            <w:proofErr w:type="spellStart"/>
-            <w:r>
-              <w:rPr>
-                <w:lang w:val="en-US"/>
-              </w:rPr>
-              <w:t>máy</w:t>
-            </w:r>
-            <w:proofErr w:type="spellEnd"/>
-            <w:r>
-              <w:rPr>
-                <w:lang w:val="en-US"/>
-              </w:rPr>
-              <w:t xml:space="preserve"> 21, </w:t>
-            </w:r>
-            <w:proofErr w:type="spellStart"/>
-            <w:r>
-              <w:rPr>
-                <w:lang w:val="en-US"/>
-              </w:rPr>
-              <w:t>máy</w:t>
-            </w:r>
-            <w:proofErr w:type="spellEnd"/>
-            <w:r>
-              <w:rPr>
-                <w:lang w:val="en-US"/>
-              </w:rPr>
-              <w:t xml:space="preserve"> 21Б</w:t>
-            </w:r>
-          </w:p>
-        </w:tc>
-        <w:tc>
-          <w:tcPr>
-            <w:tcW w:w="332" w:type="pct"/>
-            <w:vAlign w:val="center"/>
-          </w:tcPr>
-          <w:p>
-            <w:pPr>
-              <w:jc w:val="center"/>
-              <w:rPr>
-                <w:b/>
-                <w:lang w:val="en-US"/>
-              </w:rPr>
-            </w:pPr>
-            <w:r>
-              <w:rPr>
-                <w:lang w:val="en-US"/>
-              </w:rPr>
-              <w:t>1</w:t>
-            </w:r>
-          </w:p>
-        </w:tc>
-        <w:tc>
-          <w:tcPr>
-            <w:tcW w:w="469" w:type="pct"/>
-            <w:vAlign w:val="center"/>
-          </w:tcPr>
-          <w:p>
-            <w:pPr>
-              <w:jc w:val="center"/>
-              <w:rPr>
-                <w:b/>
-                <w:lang w:val="en-US"/>
-              </w:rPr>
-            </w:pPr>
-            <w:r>
-              <w:rPr>
-                <w:lang w:val="en-US"/>
-              </w:rPr>
-              <w:t>15</w:t>
-            </w:r>
-          </w:p>
-        </w:tc>
-        <w:tc>
-          <w:tcPr>
-            <w:tcW w:w="445" w:type="pct"/>
-            <w:vAlign w:val="center"/>
-          </w:tcPr>
-          <w:p>
-            <w:pPr>
-              <w:jc w:val="center"/>
-            </w:pPr>
-            <w:r>
-              <w:rPr>
-                <w:lang w:val="en-US"/>
-              </w:rPr>
-              <w:t>-</w:t>
-            </w:r>
-          </w:p>
-        </w:tc>
-        <w:tc>
-          <w:tcPr>
-            <w:tcW w:w="481" w:type="pct"/>
-            <w:vAlign w:val="center"/>
-          </w:tcPr>
-          <w:p>
-            <w:pPr>
-              <w:jc w:val="center"/>
-            </w:pPr>
-            <w:r>
-              <w:rPr>
-                <w:lang w:val="en-US"/>
-              </w:rPr>
-              <w:t>//</w:t>
-            </w:r>
-          </w:p>
-        </w:tc>
-        <w:tc>
-          <w:tcPr>
-            <w:tcW w:w="644" w:type="pct"/>
-            <w:vAlign w:val="center"/>
-          </w:tcPr>
-          <w:p>
-            <w:pPr>
-              <w:jc w:val="center"/>
-            </w:pPr>
-            <w:r>
-              <w:t>Hiển thị các đèn đầy đủ</w:t>
-            </w:r>
-          </w:p>
-        </w:tc>
-        <w:tc>
-          <w:tcPr>
-            <w:tcW w:w="308" w:type="pct"/>
-          </w:tcPr>
-          <w:p/>
-        </w:tc>
-      </w:tr>
-      <w:tr>
-        <w:tc>
-          <w:tcPr>
-            <w:tcW w:w="215" w:type="pct"/>
-            <w:vAlign w:val="center"/>
-          </w:tcPr>
-          <w:p>
-            <w:pPr>
-              <w:jc w:val="center"/>
-              <w:rPr>
-                <w:lang w:val="en-US"/>
-              </w:rPr>
-            </w:pPr>
-            <w:r>
-              <w:rPr>
-                <w:lang w:val="en-US"/>
-              </w:rPr>
-              <w:t>3</w:t>
-            </w:r>
-          </w:p>
-        </w:tc>
-        <w:tc>
-          <w:tcPr>
-            <w:tcW w:w="2106" w:type="pct"/>
-            <w:vAlign w:val="center"/>
-          </w:tcPr>
-          <w:p>
-            <w:pPr>
-              <w:jc w:val="both"/>
-              <w:rPr>
-                <w:lang w:val="en-US"/>
-              </w:rPr>
-            </w:pPr>
-            <w:proofErr w:type="spellStart"/>
-            <w:r>
-              <w:rPr>
-                <w:lang w:val="en-US"/>
-              </w:rPr>
-              <w:t>Kiểm</w:t>
-            </w:r>
-            <w:proofErr w:type="spellEnd"/>
-            <w:r>
-              <w:rPr>
-                <w:lang w:val="en-US"/>
-              </w:rPr>
-              <w:t xml:space="preserve"> </w:t>
-            </w:r>
-            <w:proofErr w:type="spellStart"/>
-            <w:r>
-              <w:rPr>
-                <w:lang w:val="en-US"/>
-              </w:rPr>
-              <w:t>tra</w:t>
-            </w:r>
-            <w:proofErr w:type="spellEnd"/>
-            <w:r>
-              <w:rPr>
-                <w:lang w:val="en-US"/>
-              </w:rPr>
-              <w:t xml:space="preserve"> </w:t>
-            </w:r>
-            <w:proofErr w:type="spellStart"/>
-            <w:r>
-              <w:rPr>
-                <w:lang w:val="en-US"/>
-              </w:rPr>
-              <w:t>tính</w:t>
-            </w:r>
-            <w:proofErr w:type="spellEnd"/>
-            <w:r>
-              <w:rPr>
-                <w:lang w:val="en-US"/>
-              </w:rPr>
-              <w:t xml:space="preserve"> </w:t>
-            </w:r>
-            <w:proofErr w:type="spellStart"/>
-            <w:r>
-              <w:rPr>
-                <w:lang w:val="en-US"/>
-              </w:rPr>
-              <w:t>hoàn</w:t>
-            </w:r>
-            <w:proofErr w:type="spellEnd"/>
-            <w:r>
-              <w:rPr>
-                <w:lang w:val="en-US"/>
-              </w:rPr>
-              <w:t xml:space="preserve"> </w:t>
-            </w:r>
-            <w:proofErr w:type="spellStart"/>
-            <w:r>
-              <w:rPr>
-                <w:lang w:val="en-US"/>
-              </w:rPr>
-              <w:t>hảo</w:t>
-            </w:r>
-            <w:proofErr w:type="spellEnd"/>
-            <w:r>
-              <w:rPr>
-                <w:lang w:val="en-US"/>
-              </w:rPr>
-              <w:t xml:space="preserve"> </w:t>
-            </w:r>
-            <w:proofErr w:type="spellStart"/>
-            <w:r>
-              <w:rPr>
-                <w:lang w:val="en-US"/>
-              </w:rPr>
-              <w:t>của</w:t>
-            </w:r>
-            <w:proofErr w:type="spellEnd"/>
-            <w:r>
-              <w:rPr>
-                <w:lang w:val="en-US"/>
-              </w:rPr>
-              <w:t xml:space="preserve"> </w:t>
-            </w:r>
-            <w:proofErr w:type="spellStart"/>
-            <w:r>
-              <w:rPr>
-                <w:lang w:val="en-US"/>
-              </w:rPr>
-              <w:t>tổ</w:t>
-            </w:r>
-            <w:proofErr w:type="spellEnd"/>
-            <w:r>
-              <w:rPr>
-                <w:lang w:val="en-US"/>
-              </w:rPr>
-              <w:t xml:space="preserve"> </w:t>
-            </w:r>
-            <w:proofErr w:type="spellStart"/>
-            <w:r>
-              <w:rPr>
-                <w:lang w:val="en-US"/>
-              </w:rPr>
-              <w:t>hợp</w:t>
-            </w:r>
-            <w:proofErr w:type="spellEnd"/>
-            <w:r>
-              <w:rPr>
-                <w:lang w:val="en-US"/>
-              </w:rPr>
-              <w:t xml:space="preserve"> </w:t>
-            </w:r>
-            <w:proofErr w:type="spellStart"/>
-            <w:r>
-              <w:rPr>
-                <w:lang w:val="en-US"/>
-              </w:rPr>
-              <w:t>theo</w:t>
-            </w:r>
-            <w:proofErr w:type="spellEnd"/>
-            <w:r>
-              <w:rPr>
-                <w:lang w:val="en-US"/>
-              </w:rPr>
-              <w:t xml:space="preserve"> </w:t>
-            </w:r>
-            <w:proofErr w:type="spellStart"/>
-            <w:r>
-              <w:rPr>
-                <w:lang w:val="en-US"/>
-              </w:rPr>
-              <w:t>các</w:t>
-            </w:r>
-            <w:proofErr w:type="spellEnd"/>
-            <w:r>
-              <w:rPr>
-                <w:lang w:val="en-US"/>
-              </w:rPr>
-              <w:t xml:space="preserve"> </w:t>
-            </w:r>
-            <w:proofErr w:type="spellStart"/>
-            <w:r>
-              <w:rPr>
-                <w:lang w:val="en-US"/>
-              </w:rPr>
-              <w:t>dấu</w:t>
-            </w:r>
-            <w:proofErr w:type="spellEnd"/>
-            <w:r>
-              <w:rPr>
-                <w:lang w:val="en-US"/>
-              </w:rPr>
-              <w:t xml:space="preserve"> </w:t>
-            </w:r>
-            <w:proofErr w:type="spellStart"/>
-            <w:r>
-              <w:rPr>
-                <w:lang w:val="en-US"/>
-              </w:rPr>
-              <w:t>hiệu</w:t>
-            </w:r>
-            <w:proofErr w:type="spellEnd"/>
-            <w:r>
-              <w:rPr>
-                <w:lang w:val="en-US"/>
-              </w:rPr>
-              <w:t xml:space="preserve"> </w:t>
-            </w:r>
-            <w:proofErr w:type="spellStart"/>
-            <w:r>
-              <w:rPr>
-                <w:lang w:val="en-US"/>
-              </w:rPr>
-              <w:t>bên</w:t>
-            </w:r>
-            <w:proofErr w:type="spellEnd"/>
-            <w:r>
-              <w:rPr>
-                <w:lang w:val="en-US"/>
-              </w:rPr>
-              <w:t xml:space="preserve"> </w:t>
-            </w:r>
-            <w:proofErr w:type="spellStart"/>
-            <w:r>
-              <w:rPr>
-                <w:lang w:val="en-US"/>
-              </w:rPr>
-              <w:t>ngoài</w:t>
-            </w:r>
-            <w:proofErr w:type="spellEnd"/>
-            <w:r>
-              <w:rPr>
-                <w:lang w:val="en-US"/>
-              </w:rPr>
-              <w:t xml:space="preserve"> (</w:t>
-            </w:r>
-            <w:proofErr w:type="spellStart"/>
-            <w:r>
-              <w:rPr>
-                <w:lang w:val="en-US"/>
-              </w:rPr>
-              <w:t>không</w:t>
-            </w:r>
-            <w:proofErr w:type="spellEnd"/>
-            <w:r>
-              <w:rPr>
-                <w:lang w:val="en-US"/>
-              </w:rPr>
-              <w:t xml:space="preserve"> </w:t>
-            </w:r>
-            <w:proofErr w:type="spellStart"/>
-            <w:r>
-              <w:rPr>
-                <w:lang w:val="en-US"/>
-              </w:rPr>
-              <w:t>có</w:t>
-            </w:r>
-            <w:proofErr w:type="spellEnd"/>
-            <w:r>
-              <w:rPr>
-                <w:lang w:val="en-US"/>
-              </w:rPr>
-              <w:t xml:space="preserve"> </w:t>
-            </w:r>
-            <w:proofErr w:type="spellStart"/>
-            <w:r>
-              <w:rPr>
-                <w:lang w:val="en-US"/>
-              </w:rPr>
-              <w:t>các</w:t>
-            </w:r>
-            <w:proofErr w:type="spellEnd"/>
-            <w:r>
-              <w:rPr>
-                <w:lang w:val="en-US"/>
-              </w:rPr>
-              <w:t xml:space="preserve"> </w:t>
-            </w:r>
-            <w:proofErr w:type="spellStart"/>
-            <w:r>
-              <w:rPr>
-                <w:lang w:val="en-US"/>
-              </w:rPr>
-              <w:t>cáp</w:t>
-            </w:r>
-            <w:proofErr w:type="spellEnd"/>
-            <w:r>
-              <w:rPr>
-                <w:lang w:val="en-US"/>
-              </w:rPr>
-              <w:t xml:space="preserve"> </w:t>
-            </w:r>
-            <w:proofErr w:type="spellStart"/>
-            <w:r>
-              <w:rPr>
-                <w:lang w:val="en-US"/>
-              </w:rPr>
-              <w:t>bị</w:t>
-            </w:r>
-            <w:proofErr w:type="spellEnd"/>
-            <w:r>
-              <w:rPr>
-                <w:lang w:val="en-US"/>
-              </w:rPr>
-              <w:t xml:space="preserve"> </w:t>
-            </w:r>
-            <w:proofErr w:type="spellStart"/>
-            <w:r>
-              <w:rPr>
-                <w:lang w:val="en-US"/>
-              </w:rPr>
-              <w:t>tháo</w:t>
-            </w:r>
-            <w:proofErr w:type="spellEnd"/>
-            <w:r>
-              <w:rPr>
-                <w:lang w:val="en-US"/>
-              </w:rPr>
-              <w:t xml:space="preserve"> </w:t>
-            </w:r>
-            <w:proofErr w:type="spellStart"/>
-            <w:r>
-              <w:rPr>
-                <w:lang w:val="en-US"/>
-              </w:rPr>
-              <w:t>ra</w:t>
-            </w:r>
-            <w:proofErr w:type="spellEnd"/>
-            <w:r>
-              <w:rPr>
-                <w:lang w:val="en-US"/>
-              </w:rPr>
-              <w:t xml:space="preserve">, </w:t>
-            </w:r>
-            <w:proofErr w:type="spellStart"/>
-            <w:r>
-              <w:rPr>
-                <w:lang w:val="en-US"/>
-              </w:rPr>
-              <w:t>không</w:t>
-            </w:r>
-            <w:proofErr w:type="spellEnd"/>
-            <w:r>
-              <w:rPr>
-                <w:lang w:val="en-US"/>
-              </w:rPr>
-              <w:t xml:space="preserve"> </w:t>
-            </w:r>
-            <w:proofErr w:type="spellStart"/>
-            <w:r>
-              <w:rPr>
-                <w:lang w:val="en-US"/>
-              </w:rPr>
-              <w:t>có</w:t>
-            </w:r>
-            <w:proofErr w:type="spellEnd"/>
-            <w:r>
-              <w:rPr>
-                <w:lang w:val="en-US"/>
-              </w:rPr>
-              <w:t xml:space="preserve"> </w:t>
-            </w:r>
-            <w:proofErr w:type="spellStart"/>
-            <w:r>
-              <w:rPr>
-                <w:lang w:val="en-US"/>
-              </w:rPr>
-              <w:t>khối</w:t>
-            </w:r>
-            <w:proofErr w:type="spellEnd"/>
-            <w:r>
-              <w:rPr>
-                <w:lang w:val="en-US"/>
-              </w:rPr>
-              <w:t xml:space="preserve">, </w:t>
-            </w:r>
-            <w:proofErr w:type="spellStart"/>
-            <w:r>
-              <w:rPr>
-                <w:lang w:val="en-US"/>
-              </w:rPr>
-              <w:t>môđun</w:t>
-            </w:r>
-            <w:proofErr w:type="spellEnd"/>
-            <w:r>
-              <w:rPr>
-                <w:lang w:val="en-US"/>
-              </w:rPr>
-              <w:t xml:space="preserve"> </w:t>
-            </w:r>
-            <w:proofErr w:type="spellStart"/>
-            <w:r>
-              <w:rPr>
-                <w:lang w:val="en-US"/>
-              </w:rPr>
-              <w:t>bị</w:t>
-            </w:r>
-            <w:proofErr w:type="spellEnd"/>
-            <w:r>
-              <w:rPr>
-                <w:lang w:val="en-US"/>
-              </w:rPr>
-              <w:t xml:space="preserve"> </w:t>
-            </w:r>
-            <w:proofErr w:type="spellStart"/>
-            <w:r>
-              <w:rPr>
-                <w:lang w:val="en-US"/>
-              </w:rPr>
-              <w:t>rút</w:t>
-            </w:r>
-            <w:proofErr w:type="spellEnd"/>
-            <w:r>
-              <w:rPr>
-                <w:lang w:val="en-US"/>
-              </w:rPr>
-              <w:t xml:space="preserve"> </w:t>
-            </w:r>
-            <w:proofErr w:type="spellStart"/>
-            <w:r>
-              <w:rPr>
-                <w:lang w:val="en-US"/>
-              </w:rPr>
-              <w:t>ra</w:t>
-            </w:r>
-            <w:proofErr w:type="spellEnd"/>
-            <w:r>
-              <w:rPr>
-                <w:lang w:val="en-US"/>
-              </w:rPr>
-              <w:t xml:space="preserve">) </w:t>
-            </w:r>
-            <w:proofErr w:type="spellStart"/>
-            <w:r>
-              <w:rPr>
-                <w:lang w:val="en-US"/>
-              </w:rPr>
-              <w:t>và</w:t>
-            </w:r>
-            <w:proofErr w:type="spellEnd"/>
-            <w:r>
-              <w:rPr>
-                <w:lang w:val="en-US"/>
-              </w:rPr>
-              <w:t xml:space="preserve"> </w:t>
-            </w:r>
-            <w:proofErr w:type="spellStart"/>
-            <w:r>
-              <w:rPr>
-                <w:lang w:val="en-US"/>
-              </w:rPr>
-              <w:t>theo</w:t>
-            </w:r>
-            <w:proofErr w:type="spellEnd"/>
-            <w:r>
-              <w:rPr>
-                <w:lang w:val="en-US"/>
-              </w:rPr>
-              <w:t xml:space="preserve"> </w:t>
-            </w:r>
-            <w:proofErr w:type="spellStart"/>
-            <w:r>
-              <w:rPr>
-                <w:lang w:val="en-US"/>
-              </w:rPr>
-              <w:t>các</w:t>
-            </w:r>
-            <w:proofErr w:type="spellEnd"/>
-            <w:r>
-              <w:rPr>
-                <w:lang w:val="en-US"/>
-              </w:rPr>
-              <w:t xml:space="preserve"> </w:t>
-            </w:r>
-            <w:proofErr w:type="spellStart"/>
-            <w:r>
-              <w:rPr>
-                <w:lang w:val="en-US"/>
-              </w:rPr>
-              <w:t>dữ</w:t>
-            </w:r>
-            <w:proofErr w:type="spellEnd"/>
-            <w:r>
-              <w:rPr>
-                <w:lang w:val="en-US"/>
-              </w:rPr>
-              <w:t xml:space="preserve"> </w:t>
-            </w:r>
-            <w:proofErr w:type="spellStart"/>
-            <w:r>
-              <w:rPr>
-                <w:lang w:val="en-US"/>
-              </w:rPr>
-              <w:t>liệu</w:t>
-            </w:r>
-            <w:proofErr w:type="spellEnd"/>
-            <w:r>
-              <w:rPr>
-                <w:lang w:val="en-US"/>
-              </w:rPr>
-              <w:t xml:space="preserve"> </w:t>
-            </w:r>
-            <w:proofErr w:type="spellStart"/>
-            <w:r>
-              <w:rPr>
-                <w:lang w:val="en-US"/>
-              </w:rPr>
-              <w:t>kiểm</w:t>
-            </w:r>
-            <w:proofErr w:type="spellEnd"/>
-            <w:r>
-              <w:rPr>
-                <w:lang w:val="en-US"/>
-              </w:rPr>
-              <w:t xml:space="preserve"> </w:t>
-            </w:r>
-            <w:proofErr w:type="spellStart"/>
-            <w:r>
-              <w:rPr>
-                <w:lang w:val="en-US"/>
-              </w:rPr>
-              <w:t>tra</w:t>
-            </w:r>
-            <w:proofErr w:type="spellEnd"/>
-            <w:r>
-              <w:rPr>
-                <w:lang w:val="en-US"/>
-              </w:rPr>
-              <w:t xml:space="preserve"> </w:t>
-            </w:r>
-            <w:proofErr w:type="spellStart"/>
-            <w:r>
-              <w:rPr>
-                <w:lang w:val="en-US"/>
-              </w:rPr>
-              <w:t>tổng</w:t>
-            </w:r>
-            <w:proofErr w:type="spellEnd"/>
-            <w:r>
-              <w:rPr>
-                <w:lang w:val="en-US"/>
-              </w:rPr>
-              <w:t xml:space="preserve"> </w:t>
-            </w:r>
-            <w:proofErr w:type="spellStart"/>
-            <w:r>
-              <w:rPr>
-                <w:lang w:val="en-US"/>
-              </w:rPr>
-              <w:t>thể</w:t>
-            </w:r>
-            <w:proofErr w:type="spellEnd"/>
-          </w:p>
-        </w:tc>
-        <w:tc>
-          <w:tcPr>
-            <w:tcW w:w="332" w:type="pct"/>
-            <w:vAlign w:val="center"/>
-          </w:tcPr>
-          <w:p>
-            <w:pPr>
-              <w:jc w:val="center"/>
-              <w:rPr>
-                <w:lang w:val="en-US"/>
-              </w:rPr>
-            </w:pPr>
-            <w:r>
-              <w:rPr>
-                <w:lang w:val="en-US"/>
-              </w:rPr>
-              <w:t>1</w:t>
-            </w:r>
-          </w:p>
-        </w:tc>
-        <w:tc>
-          <w:tcPr>
-            <w:tcW w:w="469" w:type="pct"/>
-            <w:vAlign w:val="center"/>
-          </w:tcPr>
-          <w:p>
-            <w:pPr>
-              <w:jc w:val="center"/>
-              <w:rPr>
-                <w:lang w:val="en-US"/>
-              </w:rPr>
-            </w:pPr>
-            <w:r>
-              <w:rPr>
-                <w:lang w:val="en-US"/>
-              </w:rPr>
-              <w:t>15</w:t>
-            </w:r>
-          </w:p>
-        </w:tc>
-        <w:tc>
-          <w:tcPr>
-            <w:tcW w:w="445" w:type="pct"/>
-            <w:vAlign w:val="center"/>
-          </w:tcPr>
-          <w:p>
-            <w:pPr>
-              <w:jc w:val="center"/>
-            </w:pPr>
-            <w:proofErr w:type="spellStart"/>
-            <w:r>
-              <w:rPr>
-                <w:lang w:val="en-US"/>
-              </w:rPr>
-              <w:t>Đèn</w:t>
-            </w:r>
-            <w:proofErr w:type="spellEnd"/>
-            <w:r>
-              <w:rPr>
-                <w:lang w:val="en-US"/>
-              </w:rPr>
-              <w:t xml:space="preserve"> pin</w:t>
-            </w:r>
-          </w:p>
-        </w:tc>
-        <w:tc>
-          <w:tcPr>
-            <w:tcW w:w="481" w:type="pct"/>
-            <w:vAlign w:val="center"/>
-          </w:tcPr>
-          <w:p>
-            <w:pPr>
-              <w:jc w:val="center"/>
-            </w:pPr>
-            <w:r>
-              <w:rPr>
-                <w:lang w:val="en-US"/>
-              </w:rPr>
-              <w:t>//</w:t>
-            </w:r>
-          </w:p>
-        </w:tc>
-        <w:tc>
-          <w:tcPr>
-            <w:tcW w:w="644" w:type="pct"/>
-            <w:vAlign w:val="center"/>
-          </w:tcPr>
-          <w:p>
-            <w:pPr>
-              <w:jc w:val="center"/>
-            </w:pPr>
-            <w:r>
-              <w:t>Không bị hư hỏng cơ khí, chắc chắn</w:t>
-            </w:r>
-          </w:p>
-        </w:tc>
-        <w:tc>
-          <w:tcPr>
-            <w:tcW w:w="308" w:type="pct"/>
-          </w:tcPr>
-          <w:p/>
-        </w:tc>
-      </w:tr>
-      <w:tr>
-        <w:tc>
-          <w:tcPr>
-            <w:tcW w:w="215" w:type="pct"/>
-            <w:vAlign w:val="center"/>
-          </w:tcPr>
-          <w:p>
-            <w:pPr>
-              <w:jc w:val="center"/>
-              <w:rPr>
-                <w:lang w:val="en-US"/>
-              </w:rPr>
-            </w:pPr>
-            <w:r>
-              <w:rPr>
-                <w:lang w:val="en-US"/>
-              </w:rPr>
-              <w:t>4</w:t>
-            </w:r>
-          </w:p>
-        </w:tc>
-        <w:tc>
-          <w:tcPr>
-            <w:tcW w:w="2106" w:type="pct"/>
-            <w:vAlign w:val="center"/>
-          </w:tcPr>
-          <w:p>
-            <w:pPr>
-              <w:jc w:val="both"/>
-              <w:rPr>
-                <w:lang w:val="en-US"/>
-              </w:rPr>
-            </w:pPr>
-            <w:proofErr w:type="spellStart"/>
-            <w:r>
-              <w:rPr>
-                <w:lang w:val="en-US"/>
-              </w:rPr>
-              <w:t>Kiểm</w:t>
-            </w:r>
-            <w:proofErr w:type="spellEnd"/>
-            <w:r>
-              <w:rPr>
-                <w:lang w:val="en-US"/>
-              </w:rPr>
-              <w:t xml:space="preserve"> </w:t>
-            </w:r>
-            <w:proofErr w:type="spellStart"/>
-            <w:r>
-              <w:rPr>
-                <w:lang w:val="en-US"/>
-              </w:rPr>
-              <w:t>tra</w:t>
-            </w:r>
-            <w:proofErr w:type="spellEnd"/>
-            <w:r>
-              <w:rPr>
-                <w:lang w:val="en-US"/>
-              </w:rPr>
-              <w:t xml:space="preserve"> </w:t>
-            </w:r>
-            <w:proofErr w:type="spellStart"/>
-            <w:r>
-              <w:rPr>
-                <w:lang w:val="en-US"/>
-              </w:rPr>
-              <w:t>các</w:t>
-            </w:r>
-            <w:proofErr w:type="spellEnd"/>
-            <w:r>
-              <w:rPr>
-                <w:lang w:val="en-US"/>
-              </w:rPr>
-              <w:t xml:space="preserve"> </w:t>
-            </w:r>
-            <w:proofErr w:type="spellStart"/>
-            <w:r>
-              <w:rPr>
-                <w:lang w:val="en-US"/>
-              </w:rPr>
-              <w:t>anten</w:t>
-            </w:r>
-            <w:proofErr w:type="spellEnd"/>
-            <w:r>
-              <w:rPr>
-                <w:lang w:val="en-US"/>
-              </w:rPr>
-              <w:t xml:space="preserve"> </w:t>
-            </w:r>
-            <w:proofErr w:type="spellStart"/>
-            <w:r>
-              <w:rPr>
-                <w:lang w:val="en-US"/>
-              </w:rPr>
-              <w:t>thủy</w:t>
-            </w:r>
-            <w:proofErr w:type="spellEnd"/>
-            <w:r>
-              <w:rPr>
-                <w:lang w:val="en-US"/>
-              </w:rPr>
-              <w:t xml:space="preserve"> </w:t>
-            </w:r>
-            <w:proofErr w:type="spellStart"/>
-            <w:r>
-              <w:rPr>
-                <w:lang w:val="en-US"/>
-              </w:rPr>
-              <w:t>âm</w:t>
-            </w:r>
-            <w:proofErr w:type="spellEnd"/>
-            <w:r>
-              <w:rPr>
-                <w:lang w:val="en-US"/>
-              </w:rPr>
-              <w:t xml:space="preserve"> </w:t>
-            </w:r>
-            <w:proofErr w:type="spellStart"/>
-            <w:r>
-              <w:rPr>
-                <w:lang w:val="en-US"/>
-              </w:rPr>
-              <w:t>sau</w:t>
-            </w:r>
-            <w:proofErr w:type="spellEnd"/>
-            <w:r>
-              <w:rPr>
-                <w:lang w:val="en-US"/>
-              </w:rPr>
-              <w:t xml:space="preserve"> </w:t>
-            </w:r>
-            <w:proofErr w:type="spellStart"/>
-            <w:r>
-              <w:rPr>
-                <w:lang w:val="en-US"/>
-              </w:rPr>
-              <w:t>khi</w:t>
-            </w:r>
-            <w:proofErr w:type="spellEnd"/>
-            <w:r>
-              <w:rPr>
-                <w:lang w:val="en-US"/>
-              </w:rPr>
-              <w:t xml:space="preserve"> </w:t>
-            </w:r>
-            <w:proofErr w:type="spellStart"/>
-            <w:r>
-              <w:rPr>
-                <w:lang w:val="en-US"/>
-              </w:rPr>
-              <w:t>phát</w:t>
-            </w:r>
-            <w:proofErr w:type="spellEnd"/>
-            <w:r>
-              <w:rPr>
-                <w:lang w:val="en-US"/>
-              </w:rPr>
-              <w:t xml:space="preserve"> </w:t>
-            </w:r>
-            <w:proofErr w:type="spellStart"/>
-            <w:r>
-              <w:rPr>
-                <w:lang w:val="en-US"/>
-              </w:rPr>
-              <w:t>hiện</w:t>
-            </w:r>
-            <w:proofErr w:type="spellEnd"/>
-            <w:r>
-              <w:rPr>
-                <w:lang w:val="en-US"/>
-              </w:rPr>
-              <w:t xml:space="preserve"> </w:t>
-            </w:r>
-            <w:proofErr w:type="spellStart"/>
-            <w:r>
-              <w:rPr>
-                <w:lang w:val="en-US"/>
-              </w:rPr>
-              <w:t>có</w:t>
-            </w:r>
-            <w:proofErr w:type="spellEnd"/>
-            <w:r>
-              <w:rPr>
-                <w:lang w:val="en-US"/>
-              </w:rPr>
-              <w:t xml:space="preserve"> </w:t>
-            </w:r>
-            <w:proofErr w:type="spellStart"/>
-            <w:r>
-              <w:rPr>
-                <w:lang w:val="en-US"/>
-              </w:rPr>
-              <w:t>những</w:t>
-            </w:r>
-            <w:proofErr w:type="spellEnd"/>
-            <w:r>
-              <w:rPr>
-                <w:lang w:val="en-US"/>
-              </w:rPr>
-              <w:t xml:space="preserve"> </w:t>
-            </w:r>
-            <w:proofErr w:type="spellStart"/>
-            <w:r>
-              <w:rPr>
-                <w:lang w:val="en-US"/>
-              </w:rPr>
-              <w:t>chỗ</w:t>
-            </w:r>
-            <w:proofErr w:type="spellEnd"/>
-            <w:r>
-              <w:rPr>
-                <w:lang w:val="en-US"/>
-              </w:rPr>
-              <w:t xml:space="preserve"> </w:t>
-            </w:r>
-            <w:proofErr w:type="spellStart"/>
-            <w:r>
-              <w:rPr>
-                <w:lang w:val="en-US"/>
-              </w:rPr>
-              <w:t>móp</w:t>
-            </w:r>
-            <w:proofErr w:type="spellEnd"/>
-            <w:r>
-              <w:rPr>
-                <w:lang w:val="en-US"/>
-              </w:rPr>
-              <w:t xml:space="preserve">, </w:t>
-            </w:r>
-            <w:proofErr w:type="spellStart"/>
-            <w:r>
-              <w:rPr>
-                <w:lang w:val="en-US"/>
-              </w:rPr>
-              <w:t>lõm</w:t>
-            </w:r>
-            <w:proofErr w:type="spellEnd"/>
-            <w:r>
-              <w:rPr>
-                <w:lang w:val="en-US"/>
-              </w:rPr>
-              <w:t xml:space="preserve"> (</w:t>
-            </w:r>
-            <w:proofErr w:type="spellStart"/>
-            <w:r>
-              <w:rPr>
-                <w:lang w:val="en-US"/>
-              </w:rPr>
-              <w:t>thủng</w:t>
-            </w:r>
-            <w:proofErr w:type="spellEnd"/>
-            <w:r>
-              <w:rPr>
-                <w:lang w:val="en-US"/>
-              </w:rPr>
-              <w:t xml:space="preserve">, </w:t>
-            </w:r>
-            <w:proofErr w:type="spellStart"/>
-            <w:r>
-              <w:rPr>
-                <w:lang w:val="en-US"/>
-              </w:rPr>
-              <w:t>nứt</w:t>
-            </w:r>
-            <w:proofErr w:type="spellEnd"/>
-            <w:r>
-              <w:rPr>
-                <w:lang w:val="en-US"/>
-              </w:rPr>
-              <w:t xml:space="preserve">) </w:t>
-            </w:r>
-            <w:proofErr w:type="spellStart"/>
-            <w:r>
-              <w:rPr>
-                <w:lang w:val="en-US"/>
-              </w:rPr>
-              <w:t>trên</w:t>
-            </w:r>
-            <w:proofErr w:type="spellEnd"/>
-            <w:r>
-              <w:rPr>
-                <w:lang w:val="en-US"/>
-              </w:rPr>
-              <w:t xml:space="preserve"> </w:t>
-            </w:r>
-            <w:proofErr w:type="spellStart"/>
-            <w:r>
-              <w:rPr>
-                <w:lang w:val="en-US"/>
-              </w:rPr>
-              <w:t>các</w:t>
-            </w:r>
-            <w:proofErr w:type="spellEnd"/>
-            <w:r>
-              <w:rPr>
-                <w:lang w:val="en-US"/>
-              </w:rPr>
-              <w:t xml:space="preserve"> </w:t>
-            </w:r>
-            <w:proofErr w:type="spellStart"/>
-            <w:r>
-              <w:rPr>
-                <w:lang w:val="en-US"/>
-              </w:rPr>
-              <w:t>nắp</w:t>
-            </w:r>
-            <w:proofErr w:type="spellEnd"/>
-            <w:r>
-              <w:rPr>
-                <w:lang w:val="en-US"/>
-              </w:rPr>
-              <w:t xml:space="preserve"> </w:t>
-            </w:r>
-            <w:proofErr w:type="spellStart"/>
-            <w:r>
-              <w:rPr>
-                <w:lang w:val="en-US"/>
-              </w:rPr>
-              <w:t>rẽ</w:t>
-            </w:r>
-            <w:proofErr w:type="spellEnd"/>
-            <w:r>
-              <w:rPr>
-                <w:lang w:val="en-US"/>
-              </w:rPr>
-              <w:t xml:space="preserve"> </w:t>
-            </w:r>
-            <w:proofErr w:type="spellStart"/>
-            <w:r>
-              <w:rPr>
-                <w:lang w:val="en-US"/>
-              </w:rPr>
-              <w:t>dòng</w:t>
-            </w:r>
-            <w:proofErr w:type="spellEnd"/>
-            <w:r>
-              <w:rPr>
-                <w:lang w:val="en-US"/>
-              </w:rPr>
-              <w:t xml:space="preserve"> </w:t>
-            </w:r>
-            <w:proofErr w:type="spellStart"/>
-            <w:r>
-              <w:rPr>
-                <w:lang w:val="en-US"/>
-              </w:rPr>
-              <w:t>ti</w:t>
-            </w:r>
-            <w:proofErr w:type="spellEnd"/>
-            <w:r>
-              <w:rPr>
-                <w:lang w:val="en-US"/>
-              </w:rPr>
-              <w:t xml:space="preserve"> tan (</w:t>
-            </w:r>
-            <w:proofErr w:type="spellStart"/>
-            <w:r>
-              <w:rPr>
-                <w:lang w:val="en-US"/>
-              </w:rPr>
-              <w:t>khi</w:t>
-            </w:r>
-            <w:proofErr w:type="spellEnd"/>
-            <w:r>
-              <w:rPr>
-                <w:lang w:val="en-US"/>
-              </w:rPr>
-              <w:t xml:space="preserve"> </w:t>
-            </w:r>
-            <w:proofErr w:type="spellStart"/>
-            <w:r>
-              <w:rPr>
-                <w:lang w:val="en-US"/>
-              </w:rPr>
-              <w:t>tàu</w:t>
-            </w:r>
-            <w:proofErr w:type="spellEnd"/>
-            <w:r>
-              <w:rPr>
-                <w:lang w:val="en-US"/>
-              </w:rPr>
-              <w:t xml:space="preserve"> </w:t>
-            </w:r>
-            <w:proofErr w:type="spellStart"/>
-            <w:r>
-              <w:rPr>
-                <w:lang w:val="en-US"/>
-              </w:rPr>
-              <w:t>đi</w:t>
-            </w:r>
-            <w:proofErr w:type="spellEnd"/>
-            <w:r>
-              <w:rPr>
-                <w:lang w:val="en-US"/>
-              </w:rPr>
-              <w:t xml:space="preserve"> </w:t>
-            </w:r>
-            <w:proofErr w:type="spellStart"/>
-            <w:r>
-              <w:rPr>
-                <w:lang w:val="en-US"/>
-              </w:rPr>
-              <w:t>đốc</w:t>
-            </w:r>
-            <w:proofErr w:type="spellEnd"/>
-            <w:r>
-              <w:rPr>
-                <w:lang w:val="en-US"/>
-              </w:rPr>
-              <w:t>)</w:t>
-            </w:r>
-          </w:p>
-        </w:tc>
-        <w:tc>
-          <w:tcPr>
-            <w:tcW w:w="332" w:type="pct"/>
-            <w:vAlign w:val="center"/>
-          </w:tcPr>
-          <w:p>
-            <w:pPr>
-              <w:jc w:val="center"/>
-              <w:rPr>
-                <w:lang w:val="en-US"/>
-              </w:rPr>
-            </w:pPr>
-            <w:r>
-              <w:rPr>
-                <w:lang w:val="en-US"/>
-              </w:rPr>
-              <w:t>1</w:t>
-            </w:r>
-          </w:p>
-        </w:tc>
-        <w:tc>
-          <w:tcPr>
-            <w:tcW w:w="469" w:type="pct"/>
-            <w:vAlign w:val="center"/>
-          </w:tcPr>
-          <w:p>
-            <w:pPr>
-              <w:jc w:val="center"/>
-              <w:rPr>
-                <w:lang w:val="en-US"/>
-              </w:rPr>
-            </w:pPr>
-            <w:r>
-              <w:rPr>
-                <w:lang w:val="en-US"/>
-              </w:rPr>
-              <w:t>45</w:t>
-            </w:r>
-          </w:p>
-        </w:tc>
-        <w:tc>
-          <w:tcPr>
-            <w:tcW w:w="445" w:type="pct"/>
-            <w:vAlign w:val="center"/>
-          </w:tcPr>
-          <w:p>
-            <w:pPr>
-              <w:jc w:val="center"/>
-            </w:pPr>
-            <w:proofErr w:type="spellStart"/>
-            <w:r>
-              <w:rPr>
-                <w:lang w:val="en-US"/>
-              </w:rPr>
-              <w:t>Đèn</w:t>
-            </w:r>
-            <w:proofErr w:type="spellEnd"/>
-            <w:r>
-              <w:rPr>
-                <w:lang w:val="en-US"/>
-              </w:rPr>
-              <w:t xml:space="preserve"> pin</w:t>
-            </w:r>
-          </w:p>
-        </w:tc>
-        <w:tc>
-          <w:tcPr>
-            <w:tcW w:w="481" w:type="pct"/>
-            <w:vAlign w:val="center"/>
-          </w:tcPr>
-          <w:p>
-            <w:pPr>
-              <w:jc w:val="center"/>
-            </w:pPr>
-            <w:proofErr w:type="spellStart"/>
-            <w:r>
-              <w:rPr>
-                <w:lang w:val="en-US"/>
-              </w:rPr>
-              <w:t>Găng</w:t>
-            </w:r>
-            <w:proofErr w:type="spellEnd"/>
-            <w:r>
-              <w:rPr>
-                <w:lang w:val="en-US"/>
-              </w:rPr>
-              <w:t xml:space="preserve"> </w:t>
-            </w:r>
-            <w:proofErr w:type="spellStart"/>
-            <w:r>
-              <w:rPr>
-                <w:lang w:val="en-US"/>
-              </w:rPr>
-              <w:t>tay</w:t>
-            </w:r>
-            <w:proofErr w:type="spellEnd"/>
-          </w:p>
-        </w:tc>
-        <w:tc>
-          <w:tcPr>
-            <w:tcW w:w="644" w:type="pct"/>
-            <w:vAlign w:val="center"/>
-          </w:tcPr>
-          <w:p>
-            <w:pPr>
-              <w:jc w:val="center"/>
-            </w:pPr>
-            <w:r>
-              <w:t>Không bị hư hỏng cơ khí, sạch sẽ</w:t>
-            </w:r>
-          </w:p>
-        </w:tc>
-        <w:tc>
-          <w:tcPr>
-            <w:tcW w:w="308" w:type="pct"/>
-          </w:tcPr>
-          <w:p/>
-        </w:tc>
-      </w:tr>
-      <w:tr>
-        <w:tc>
-          <w:tcPr>
-            <w:tcW w:w="215" w:type="pct"/>
-            <w:vAlign w:val="center"/>
-          </w:tcPr>
-          <w:p>
-            <w:pPr>
-              <w:jc w:val="center"/>
-              <w:rPr>
-                <w:lang w:val="en-US"/>
-              </w:rPr>
-            </w:pPr>
-            <w:r>
-              <w:rPr>
-                <w:lang w:val="en-US"/>
-              </w:rPr>
-              <w:t>5</w:t>
-            </w:r>
-          </w:p>
-        </w:tc>
-        <w:tc>
-          <w:tcPr>
-            <w:tcW w:w="2106" w:type="pct"/>
-            <w:vAlign w:val="center"/>
-          </w:tcPr>
-          <w:p>
-            <w:pPr>
-              <w:jc w:val="both"/>
-            </w:pPr>
-            <w:proofErr w:type="spellStart"/>
-            <w:r>
-              <w:rPr>
-                <w:b/>
-                <w:lang w:val="en-US"/>
-              </w:rPr>
-              <w:t>Tổng</w:t>
-            </w:r>
-            <w:proofErr w:type="spellEnd"/>
-          </w:p>
-        </w:tc>
-        <w:tc>
-          <w:tcPr>
-            <w:tcW w:w="332" w:type="pct"/>
-            <w:vAlign w:val="center"/>
-          </w:tcPr>
-          <w:p>
-            <w:pPr>
-              <w:jc w:val="center"/>
-            </w:pPr>
-          </w:p>
-        </w:tc>
-        <w:tc>
-          <w:tcPr>
-            <w:tcW w:w="469" w:type="pct"/>
-            <w:vAlign w:val="center"/>
-          </w:tcPr>
-          <w:p>
-            <w:pPr>
-              <w:jc w:val="center"/>
-              <w:rPr>
-                <w:b/>
-                <w:lang w:val="en-US"/>
-              </w:rPr>
-            </w:pPr>
-            <w:r>
-              <w:rPr>
-                <w:b/>
-                <w:lang w:val="en-US"/>
-              </w:rPr>
-              <w:t>120</w:t>
-            </w:r>
-          </w:p>
-        </w:tc>
-        <w:tc>
-          <w:tcPr>
-            <w:tcW w:w="445" w:type="pct"/>
-            <w:vAlign w:val="center"/>
-          </w:tcPr>
-          <w:p>
-            <w:pPr>
-              <w:jc w:val="center"/>
-            </w:pPr>
-          </w:p>
-        </w:tc>
-        <w:tc>
-          <w:tcPr>
-            <w:tcW w:w="481" w:type="pct"/>
-            <w:vAlign w:val="center"/>
-          </w:tcPr>
-          <w:p>
-            <w:pPr>
-              <w:jc w:val="center"/>
-            </w:pPr>
-          </w:p>
-        </w:tc>
-        <w:tc>
-          <w:tcPr>
-            <w:tcW w:w="644" w:type="pct"/>
-            <w:vAlign w:val="center"/>
-          </w:tcPr>
-          <w:p>
-            <w:pPr>
-              <w:jc w:val="center"/>
-            </w:pPr>
-          </w:p>
-        </w:tc>
-        <w:tc>
-          <w:tcPr>
-            <w:tcW w:w="308" w:type="pct"/>
-          </w:tcPr>
-          <w:p/>
-        </w:tc>
-      </w:tr>
+      <w:bookmarkEnd w:id="0"/>
     </w:tbl>
     <w:p>
       <w:pPr>
@@ -3633,6 +1753,7 @@
         <w:br w:type="page"/>
       </w:r>
     </w:p>
+    <w:p/>
     <w:sectPr>
       <w:headerReference w:type="default" r:id="rId8"/>
       <w:pgSz w:w="16840" w:h="11907" w:orient="landscape" w:code="9"/>

</xml_diff>